<commit_message>
fix: resolve Ruff I001/W605 errors & enhance strategy risk management - Fix import sorting and invalid escape sequences - Implement wider stops (3.5x ATR, 5.5% min) and 2.5 R:R target - Add primary trend filter (avoid LONG in strong downtrend) - Add daily loss limit (-3%), correlation checks, and confidence scoring
</commit_message>
<xml_diff>
--- a/lalu bagaimana kita bisa mengetahui jika sistem berhasil eksekusi trading.docx
+++ b/lalu bagaimana kita bisa mengetahui jika sistem berhasil eksekusi trading.docx
@@ -538,7 +538,7 @@
     <w:p>
       <w:r>
         <w:pict w14:anchorId="564B3E67">
-          <v:rect id="_x0000_i1037" style="width:0;height:1.5pt" o:hralign="center" o:hrstd="t" o:hr="t" fillcolor="#a0a0a0" stroked="f"/>
+          <v:rect id="_x0000_i1025" style="width:0;height:1.5pt" o:hralign="center" o:hrstd="t" o:hr="t" fillcolor="#a0a0a0" stroked="f"/>
         </w:pict>
       </w:r>
     </w:p>
@@ -1536,7 +1536,7 @@
       <w:r>
         <w:lastRenderedPageBreak/>
         <w:pict w14:anchorId="1FA5C8D1">
-          <v:rect id="_x0000_i1038" style="width:0;height:1.5pt" o:hralign="center" o:hrstd="t" o:hr="t" fillcolor="#a0a0a0" stroked="f"/>
+          <v:rect id="_x0000_i1026" style="width:0;height:1.5pt" o:hralign="center" o:hrstd="t" o:hr="t" fillcolor="#a0a0a0" stroked="f"/>
         </w:pict>
       </w:r>
     </w:p>
@@ -2624,6 +2624,2861 @@
         <w:t>.</w:t>
       </w:r>
     </w:p>
+    <w:p/>
+    <w:p>
+      <w:pPr>
+        <w:rPr>
+          <w:b/>
+          <w:bCs/>
+        </w:rPr>
+      </w:pPr>
+      <w:r>
+        <w:rPr>
+          <w:rFonts w:ascii="Segoe UI Emoji" w:hAnsi="Segoe UI Emoji" w:cs="Segoe UI Emoji"/>
+          <w:b/>
+          <w:bCs/>
+        </w:rPr>
+        <w:t>🧠</w:t>
+      </w:r>
+      <w:r>
+        <w:rPr>
+          <w:b/>
+          <w:bCs/>
+        </w:rPr>
+        <w:t xml:space="preserve"> </w:t>
+      </w:r>
+      <w:proofErr w:type="spellStart"/>
+      <w:r>
+        <w:rPr>
+          <w:b/>
+          <w:bCs/>
+        </w:rPr>
+        <w:t>Rekomendasi</w:t>
+      </w:r>
+      <w:proofErr w:type="spellEnd"/>
+      <w:r>
+        <w:rPr>
+          <w:b/>
+          <w:bCs/>
+        </w:rPr>
+        <w:t xml:space="preserve"> Cerdas: 100% Setuju, PANTAU DAHULU 1 s/d 2 </w:t>
+      </w:r>
+      <w:proofErr w:type="spellStart"/>
+      <w:r>
+        <w:rPr>
+          <w:b/>
+          <w:bCs/>
+        </w:rPr>
+        <w:t>Minggu</w:t>
+      </w:r>
+      <w:proofErr w:type="spellEnd"/>
+      <w:r>
+        <w:rPr>
+          <w:b/>
+          <w:bCs/>
+        </w:rPr>
+        <w:t>!</w:t>
+      </w:r>
+    </w:p>
+    <w:p>
+      <w:r>
+        <w:t xml:space="preserve">Keputusan Anda </w:t>
+      </w:r>
+      <w:proofErr w:type="spellStart"/>
+      <w:r>
+        <w:t>untuk</w:t>
+      </w:r>
+      <w:proofErr w:type="spellEnd"/>
+      <w:r>
+        <w:t xml:space="preserve"> </w:t>
+      </w:r>
+      <w:proofErr w:type="spellStart"/>
+      <w:r>
+        <w:rPr>
+          <w:b/>
+          <w:bCs/>
+        </w:rPr>
+        <w:t>menahan</w:t>
+      </w:r>
+      <w:proofErr w:type="spellEnd"/>
+      <w:r>
+        <w:rPr>
+          <w:b/>
+          <w:bCs/>
+        </w:rPr>
+        <w:t xml:space="preserve"> </w:t>
+      </w:r>
+      <w:proofErr w:type="spellStart"/>
+      <w:r>
+        <w:rPr>
+          <w:b/>
+          <w:bCs/>
+        </w:rPr>
+        <w:t>diri</w:t>
+      </w:r>
+      <w:proofErr w:type="spellEnd"/>
+      <w:r>
+        <w:rPr>
+          <w:b/>
+          <w:bCs/>
+        </w:rPr>
+        <w:t xml:space="preserve"> dan </w:t>
+      </w:r>
+      <w:proofErr w:type="spellStart"/>
+      <w:r>
+        <w:rPr>
+          <w:b/>
+          <w:bCs/>
+        </w:rPr>
+        <w:t>memantau</w:t>
+      </w:r>
+      <w:proofErr w:type="spellEnd"/>
+      <w:r>
+        <w:rPr>
+          <w:b/>
+          <w:bCs/>
+        </w:rPr>
+        <w:t xml:space="preserve"> </w:t>
+      </w:r>
+      <w:proofErr w:type="spellStart"/>
+      <w:r>
+        <w:rPr>
+          <w:b/>
+          <w:bCs/>
+        </w:rPr>
+        <w:t>terlebih</w:t>
+      </w:r>
+      <w:proofErr w:type="spellEnd"/>
+      <w:r>
+        <w:rPr>
+          <w:b/>
+          <w:bCs/>
+        </w:rPr>
+        <w:t xml:space="preserve"> </w:t>
+      </w:r>
+      <w:proofErr w:type="spellStart"/>
+      <w:r>
+        <w:rPr>
+          <w:b/>
+          <w:bCs/>
+        </w:rPr>
+        <w:t>dahulu</w:t>
+      </w:r>
+      <w:proofErr w:type="spellEnd"/>
+      <w:r>
+        <w:rPr>
+          <w:b/>
+          <w:bCs/>
+        </w:rPr>
+        <w:t xml:space="preserve"> </w:t>
+      </w:r>
+      <w:proofErr w:type="spellStart"/>
+      <w:r>
+        <w:rPr>
+          <w:b/>
+          <w:bCs/>
+        </w:rPr>
+        <w:t>selama</w:t>
+      </w:r>
+      <w:proofErr w:type="spellEnd"/>
+      <w:r>
+        <w:rPr>
+          <w:b/>
+          <w:bCs/>
+        </w:rPr>
+        <w:t xml:space="preserve"> 1 </w:t>
+      </w:r>
+      <w:proofErr w:type="spellStart"/>
+      <w:r>
+        <w:rPr>
+          <w:b/>
+          <w:bCs/>
+        </w:rPr>
+        <w:t>hingga</w:t>
+      </w:r>
+      <w:proofErr w:type="spellEnd"/>
+      <w:r>
+        <w:rPr>
+          <w:b/>
+          <w:bCs/>
+        </w:rPr>
+        <w:t xml:space="preserve"> 2 </w:t>
+      </w:r>
+      <w:proofErr w:type="spellStart"/>
+      <w:r>
+        <w:rPr>
+          <w:b/>
+          <w:bCs/>
+        </w:rPr>
+        <w:t>minggu</w:t>
+      </w:r>
+      <w:proofErr w:type="spellEnd"/>
+      <w:r>
+        <w:rPr>
+          <w:b/>
+          <w:bCs/>
+        </w:rPr>
+        <w:t xml:space="preserve"> </w:t>
+      </w:r>
+      <w:proofErr w:type="spellStart"/>
+      <w:r>
+        <w:rPr>
+          <w:b/>
+          <w:bCs/>
+        </w:rPr>
+        <w:t>adalah</w:t>
+      </w:r>
+      <w:proofErr w:type="spellEnd"/>
+      <w:r>
+        <w:rPr>
+          <w:b/>
+          <w:bCs/>
+        </w:rPr>
+        <w:t xml:space="preserve"> </w:t>
+      </w:r>
+      <w:proofErr w:type="spellStart"/>
+      <w:r>
+        <w:rPr>
+          <w:b/>
+          <w:bCs/>
+        </w:rPr>
+        <w:t>langkah</w:t>
+      </w:r>
+      <w:proofErr w:type="spellEnd"/>
+      <w:r>
+        <w:rPr>
+          <w:b/>
+          <w:bCs/>
+        </w:rPr>
+        <w:t xml:space="preserve"> paling </w:t>
+      </w:r>
+      <w:proofErr w:type="spellStart"/>
+      <w:r>
+        <w:rPr>
+          <w:b/>
+          <w:bCs/>
+        </w:rPr>
+        <w:t>bijak</w:t>
+      </w:r>
+      <w:proofErr w:type="spellEnd"/>
+      <w:r>
+        <w:rPr>
+          <w:b/>
+          <w:bCs/>
+        </w:rPr>
+        <w:t xml:space="preserve">, </w:t>
+      </w:r>
+      <w:proofErr w:type="spellStart"/>
+      <w:r>
+        <w:rPr>
+          <w:b/>
+          <w:bCs/>
+        </w:rPr>
+        <w:t>dewasa</w:t>
+      </w:r>
+      <w:proofErr w:type="spellEnd"/>
+      <w:r>
+        <w:rPr>
+          <w:b/>
+          <w:bCs/>
+        </w:rPr>
+        <w:t xml:space="preserve">, dan </w:t>
+      </w:r>
+      <w:proofErr w:type="spellStart"/>
+      <w:r>
+        <w:rPr>
+          <w:b/>
+          <w:bCs/>
+        </w:rPr>
+        <w:t>profesional</w:t>
+      </w:r>
+      <w:proofErr w:type="spellEnd"/>
+      <w:r>
+        <w:rPr>
+          <w:b/>
+          <w:bCs/>
+        </w:rPr>
+        <w:t>.</w:t>
+      </w:r>
+    </w:p>
+    <w:p>
+      <w:r>
+        <w:t xml:space="preserve">Di dunia </w:t>
+      </w:r>
+      <w:r>
+        <w:rPr>
+          <w:i/>
+          <w:iCs/>
+        </w:rPr>
+        <w:t>quantitative fund</w:t>
+      </w:r>
+      <w:r>
+        <w:t xml:space="preserve">, </w:t>
+      </w:r>
+      <w:proofErr w:type="spellStart"/>
+      <w:r>
+        <w:t>fase</w:t>
+      </w:r>
+      <w:proofErr w:type="spellEnd"/>
+      <w:r>
+        <w:t xml:space="preserve"> </w:t>
+      </w:r>
+      <w:proofErr w:type="spellStart"/>
+      <w:r>
+        <w:t>ini</w:t>
+      </w:r>
+      <w:proofErr w:type="spellEnd"/>
+      <w:r>
+        <w:t xml:space="preserve"> </w:t>
+      </w:r>
+      <w:proofErr w:type="spellStart"/>
+      <w:r>
+        <w:t>disebut</w:t>
+      </w:r>
+      <w:proofErr w:type="spellEnd"/>
+      <w:r>
+        <w:t xml:space="preserve"> </w:t>
+      </w:r>
+      <w:r>
+        <w:rPr>
+          <w:b/>
+          <w:bCs/>
+        </w:rPr>
+        <w:t xml:space="preserve">Fase </w:t>
+      </w:r>
+      <w:proofErr w:type="spellStart"/>
+      <w:r>
+        <w:rPr>
+          <w:b/>
+          <w:bCs/>
+        </w:rPr>
+        <w:t>Inkubasi</w:t>
+      </w:r>
+      <w:proofErr w:type="spellEnd"/>
+      <w:r>
+        <w:rPr>
+          <w:b/>
+          <w:bCs/>
+        </w:rPr>
+        <w:t xml:space="preserve"> &amp; </w:t>
+      </w:r>
+      <w:proofErr w:type="spellStart"/>
+      <w:r>
+        <w:rPr>
+          <w:b/>
+          <w:bCs/>
+        </w:rPr>
+        <w:t>Validasi</w:t>
+      </w:r>
+      <w:proofErr w:type="spellEnd"/>
+      <w:r>
+        <w:rPr>
+          <w:b/>
+          <w:bCs/>
+        </w:rPr>
+        <w:t xml:space="preserve"> Pasar (</w:t>
+      </w:r>
+      <w:r>
+        <w:rPr>
+          <w:b/>
+          <w:bCs/>
+          <w:i/>
+          <w:iCs/>
+        </w:rPr>
+        <w:t>Live Incubation Phase</w:t>
+      </w:r>
+      <w:r>
+        <w:rPr>
+          <w:b/>
+          <w:bCs/>
+        </w:rPr>
+        <w:t>)</w:t>
+      </w:r>
+      <w:r>
+        <w:t xml:space="preserve">. </w:t>
+      </w:r>
+      <w:proofErr w:type="spellStart"/>
+      <w:r>
+        <w:t>Berikut</w:t>
+      </w:r>
+      <w:proofErr w:type="spellEnd"/>
+      <w:r>
+        <w:t xml:space="preserve"> </w:t>
+      </w:r>
+      <w:proofErr w:type="spellStart"/>
+      <w:r>
+        <w:t>adalah</w:t>
+      </w:r>
+      <w:proofErr w:type="spellEnd"/>
+      <w:r>
+        <w:t xml:space="preserve"> </w:t>
+      </w:r>
+      <w:proofErr w:type="spellStart"/>
+      <w:r>
+        <w:t>alasan</w:t>
+      </w:r>
+      <w:proofErr w:type="spellEnd"/>
+      <w:r>
+        <w:t xml:space="preserve"> fundamental </w:t>
+      </w:r>
+      <w:proofErr w:type="spellStart"/>
+      <w:r>
+        <w:t>mengapa</w:t>
+      </w:r>
+      <w:proofErr w:type="spellEnd"/>
+      <w:r>
+        <w:t xml:space="preserve"> </w:t>
+      </w:r>
+      <w:proofErr w:type="spellStart"/>
+      <w:r>
+        <w:t>langkah</w:t>
+      </w:r>
+      <w:proofErr w:type="spellEnd"/>
+      <w:r>
+        <w:t xml:space="preserve"> </w:t>
+      </w:r>
+      <w:proofErr w:type="spellStart"/>
+      <w:r>
+        <w:t>ini</w:t>
+      </w:r>
+      <w:proofErr w:type="spellEnd"/>
+      <w:r>
+        <w:t xml:space="preserve"> </w:t>
+      </w:r>
+      <w:proofErr w:type="spellStart"/>
+      <w:r>
+        <w:t>adalah</w:t>
+      </w:r>
+      <w:proofErr w:type="spellEnd"/>
+      <w:r>
+        <w:t xml:space="preserve"> </w:t>
+      </w:r>
+      <w:proofErr w:type="spellStart"/>
+      <w:r>
+        <w:t>keputusan</w:t>
+      </w:r>
+      <w:proofErr w:type="spellEnd"/>
+      <w:r>
+        <w:t xml:space="preserve"> </w:t>
+      </w:r>
+      <w:proofErr w:type="spellStart"/>
+      <w:r>
+        <w:t>terbaik</w:t>
+      </w:r>
+      <w:proofErr w:type="spellEnd"/>
+      <w:r>
+        <w:t>:</w:t>
+      </w:r>
+    </w:p>
+    <w:p>
+      <w:r>
+        <w:lastRenderedPageBreak/>
+        <w:pict w14:anchorId="41F029E1">
+          <v:rect id="_x0000_i1045" style="width:0;height:1.5pt" o:hralign="center" o:hrstd="t" o:hr="t" fillcolor="#a0a0a0" stroked="f"/>
+        </w:pict>
+      </w:r>
+    </w:p>
+    <w:p>
+      <w:pPr>
+        <w:rPr>
+          <w:b/>
+          <w:bCs/>
+        </w:rPr>
+      </w:pPr>
+      <w:r>
+        <w:rPr>
+          <w:b/>
+          <w:bCs/>
+        </w:rPr>
+        <w:t xml:space="preserve">1. </w:t>
+      </w:r>
+      <w:proofErr w:type="spellStart"/>
+      <w:r>
+        <w:rPr>
+          <w:b/>
+          <w:bCs/>
+        </w:rPr>
+        <w:t>Mengapa</w:t>
+      </w:r>
+      <w:proofErr w:type="spellEnd"/>
+      <w:r>
+        <w:rPr>
+          <w:b/>
+          <w:bCs/>
+        </w:rPr>
+        <w:t xml:space="preserve"> Kita Tidak </w:t>
+      </w:r>
+      <w:proofErr w:type="spellStart"/>
+      <w:r>
+        <w:rPr>
+          <w:b/>
+          <w:bCs/>
+        </w:rPr>
+        <w:t>Perlu</w:t>
+      </w:r>
+      <w:proofErr w:type="spellEnd"/>
+      <w:r>
+        <w:rPr>
+          <w:b/>
+          <w:bCs/>
+        </w:rPr>
+        <w:t xml:space="preserve"> </w:t>
+      </w:r>
+      <w:proofErr w:type="spellStart"/>
+      <w:r>
+        <w:rPr>
+          <w:b/>
+          <w:bCs/>
+        </w:rPr>
+        <w:t>Menambah</w:t>
+      </w:r>
+      <w:proofErr w:type="spellEnd"/>
+      <w:r>
+        <w:rPr>
+          <w:b/>
+          <w:bCs/>
+        </w:rPr>
+        <w:t xml:space="preserve"> Modal Hari Ini?</w:t>
+      </w:r>
+    </w:p>
+    <w:p>
+      <w:pPr>
+        <w:numPr>
+          <w:ilvl w:val="0"/>
+          <w:numId w:val="4"/>
+        </w:numPr>
+      </w:pPr>
+      <w:proofErr w:type="spellStart"/>
+      <w:r>
+        <w:rPr>
+          <w:b/>
+          <w:bCs/>
+        </w:rPr>
+        <w:t>Biarkan</w:t>
+      </w:r>
+      <w:proofErr w:type="spellEnd"/>
+      <w:r>
+        <w:rPr>
+          <w:b/>
+          <w:bCs/>
+        </w:rPr>
+        <w:t xml:space="preserve"> Bot </w:t>
+      </w:r>
+      <w:proofErr w:type="spellStart"/>
+      <w:r>
+        <w:rPr>
+          <w:b/>
+          <w:bCs/>
+        </w:rPr>
+        <w:t>Membuktikan</w:t>
+      </w:r>
+      <w:proofErr w:type="spellEnd"/>
+      <w:r>
+        <w:rPr>
+          <w:b/>
+          <w:bCs/>
+        </w:rPr>
+        <w:t xml:space="preserve"> </w:t>
+      </w:r>
+      <w:proofErr w:type="spellStart"/>
+      <w:r>
+        <w:rPr>
+          <w:b/>
+          <w:bCs/>
+        </w:rPr>
+        <w:t>Kinerjanya</w:t>
+      </w:r>
+      <w:proofErr w:type="spellEnd"/>
+      <w:r>
+        <w:rPr>
+          <w:b/>
+          <w:bCs/>
+        </w:rPr>
+        <w:t xml:space="preserve"> </w:t>
+      </w:r>
+      <w:proofErr w:type="spellStart"/>
+      <w:r>
+        <w:rPr>
+          <w:b/>
+          <w:bCs/>
+        </w:rPr>
+        <w:t>Sendiri</w:t>
+      </w:r>
+      <w:proofErr w:type="spellEnd"/>
+      <w:r>
+        <w:rPr>
+          <w:b/>
+          <w:bCs/>
+        </w:rPr>
+        <w:t xml:space="preserve"> (</w:t>
+      </w:r>
+      <w:r>
+        <w:rPr>
+          <w:b/>
+          <w:bCs/>
+          <w:i/>
+          <w:iCs/>
+        </w:rPr>
+        <w:t>Proof of Work</w:t>
+      </w:r>
+      <w:r>
+        <w:rPr>
+          <w:b/>
+          <w:bCs/>
+        </w:rPr>
+        <w:t>):</w:t>
+      </w:r>
+    </w:p>
+    <w:p>
+      <w:pPr>
+        <w:numPr>
+          <w:ilvl w:val="1"/>
+          <w:numId w:val="4"/>
+        </w:numPr>
+      </w:pPr>
+      <w:proofErr w:type="spellStart"/>
+      <w:r>
+        <w:t>Semua</w:t>
+      </w:r>
+      <w:proofErr w:type="spellEnd"/>
+      <w:r>
+        <w:t xml:space="preserve"> </w:t>
+      </w:r>
+      <w:proofErr w:type="spellStart"/>
+      <w:r>
+        <w:t>perbaikan</w:t>
+      </w:r>
+      <w:proofErr w:type="spellEnd"/>
+      <w:r>
+        <w:t xml:space="preserve"> </w:t>
+      </w:r>
+      <w:proofErr w:type="spellStart"/>
+      <w:r>
+        <w:t>penting</w:t>
+      </w:r>
+      <w:proofErr w:type="spellEnd"/>
+      <w:r>
+        <w:t xml:space="preserve"> </w:t>
+      </w:r>
+      <w:proofErr w:type="spellStart"/>
+      <w:r>
+        <w:t>baru</w:t>
+      </w:r>
+      <w:proofErr w:type="spellEnd"/>
+      <w:r>
+        <w:t xml:space="preserve"> </w:t>
+      </w:r>
+      <w:proofErr w:type="spellStart"/>
+      <w:r>
+        <w:t>saja</w:t>
+      </w:r>
+      <w:proofErr w:type="spellEnd"/>
+      <w:r>
+        <w:t xml:space="preserve"> </w:t>
+      </w:r>
+      <w:proofErr w:type="spellStart"/>
+      <w:r>
+        <w:t>kita</w:t>
+      </w:r>
+      <w:proofErr w:type="spellEnd"/>
+      <w:r>
+        <w:t xml:space="preserve"> </w:t>
+      </w:r>
+      <w:proofErr w:type="spellStart"/>
+      <w:r>
+        <w:t>tuntaskan</w:t>
+      </w:r>
+      <w:proofErr w:type="spellEnd"/>
+      <w:r>
+        <w:t>:</w:t>
+      </w:r>
+    </w:p>
+    <w:p>
+      <w:pPr>
+        <w:numPr>
+          <w:ilvl w:val="2"/>
+          <w:numId w:val="4"/>
+        </w:numPr>
+      </w:pPr>
+      <w:r>
+        <w:rPr>
+          <w:rFonts w:ascii="Segoe UI Emoji" w:hAnsi="Segoe UI Emoji" w:cs="Segoe UI Emoji"/>
+        </w:rPr>
+        <w:t>✅</w:t>
+      </w:r>
+      <w:r>
+        <w:t xml:space="preserve"> Sizing </w:t>
+      </w:r>
+      <w:proofErr w:type="spellStart"/>
+      <w:r>
+        <w:t>adaptif</w:t>
+      </w:r>
+      <w:proofErr w:type="spellEnd"/>
+      <w:r>
+        <w:t xml:space="preserve"> </w:t>
+      </w:r>
+      <w:proofErr w:type="spellStart"/>
+      <w:r>
+        <w:t>mikro</w:t>
+      </w:r>
+      <w:proofErr w:type="spellEnd"/>
+      <w:r>
+        <w:t xml:space="preserve"> (</w:t>
+      </w:r>
+      <w:proofErr w:type="spellStart"/>
+      <w:r>
+        <w:t>bebas</w:t>
+      </w:r>
+      <w:proofErr w:type="spellEnd"/>
+      <w:r>
+        <w:t xml:space="preserve"> </w:t>
+      </w:r>
+      <w:proofErr w:type="spellStart"/>
+      <w:r>
+        <w:t>hambatan</w:t>
+      </w:r>
+      <w:proofErr w:type="spellEnd"/>
+      <w:r>
+        <w:t xml:space="preserve"> minimum Binance).</w:t>
+      </w:r>
+    </w:p>
+    <w:p>
+      <w:pPr>
+        <w:numPr>
+          <w:ilvl w:val="2"/>
+          <w:numId w:val="4"/>
+        </w:numPr>
+      </w:pPr>
+      <w:r>
+        <w:rPr>
+          <w:rFonts w:ascii="Segoe UI Emoji" w:hAnsi="Segoe UI Emoji" w:cs="Segoe UI Emoji"/>
+        </w:rPr>
+        <w:t>✅</w:t>
+      </w:r>
+      <w:r>
+        <w:t xml:space="preserve"> Ruang </w:t>
+      </w:r>
+      <w:proofErr w:type="spellStart"/>
+      <w:r>
+        <w:t>nafas</w:t>
+      </w:r>
+      <w:proofErr w:type="spellEnd"/>
+      <w:r>
+        <w:t xml:space="preserve"> Stop Loss (2.6% anti-</w:t>
+      </w:r>
+      <w:proofErr w:type="spellStart"/>
+      <w:r>
+        <w:t>jarum</w:t>
+      </w:r>
+      <w:proofErr w:type="spellEnd"/>
+      <w:r>
+        <w:t xml:space="preserve"> wick).</w:t>
+      </w:r>
+    </w:p>
+    <w:p>
+      <w:pPr>
+        <w:numPr>
+          <w:ilvl w:val="2"/>
+          <w:numId w:val="4"/>
+        </w:numPr>
+      </w:pPr>
+      <w:r>
+        <w:rPr>
+          <w:rFonts w:ascii="Segoe UI Emoji" w:hAnsi="Segoe UI Emoji" w:cs="Segoe UI Emoji"/>
+        </w:rPr>
+        <w:t>✅</w:t>
+      </w:r>
+      <w:r>
+        <w:t xml:space="preserve"> Mode </w:t>
+      </w:r>
+      <w:proofErr w:type="spellStart"/>
+      <w:r>
+        <w:t>murni</w:t>
+      </w:r>
+      <w:proofErr w:type="spellEnd"/>
+      <w:r>
+        <w:t xml:space="preserve"> Spot Long (</w:t>
+      </w:r>
+      <w:proofErr w:type="spellStart"/>
+      <w:r>
+        <w:t>tanpa</w:t>
+      </w:r>
+      <w:proofErr w:type="spellEnd"/>
+      <w:r>
+        <w:t xml:space="preserve"> short salah </w:t>
+      </w:r>
+      <w:proofErr w:type="spellStart"/>
+      <w:r>
+        <w:t>arah</w:t>
+      </w:r>
+      <w:proofErr w:type="spellEnd"/>
+      <w:r>
+        <w:t>).</w:t>
+      </w:r>
+    </w:p>
+    <w:p>
+      <w:pPr>
+        <w:numPr>
+          <w:ilvl w:val="1"/>
+          <w:numId w:val="4"/>
+        </w:numPr>
+      </w:pPr>
+      <w:proofErr w:type="spellStart"/>
+      <w:r>
+        <w:t>Biarkan</w:t>
+      </w:r>
+      <w:proofErr w:type="spellEnd"/>
+      <w:r>
+        <w:t xml:space="preserve"> bot </w:t>
+      </w:r>
+      <w:proofErr w:type="spellStart"/>
+      <w:r>
+        <w:t>menyelesaikan</w:t>
+      </w:r>
+      <w:proofErr w:type="spellEnd"/>
+      <w:r>
+        <w:t xml:space="preserve"> </w:t>
+      </w:r>
+      <w:proofErr w:type="spellStart"/>
+      <w:r>
+        <w:rPr>
+          <w:b/>
+          <w:bCs/>
+        </w:rPr>
+        <w:t>siklus</w:t>
+      </w:r>
+      <w:proofErr w:type="spellEnd"/>
+      <w:r>
+        <w:rPr>
+          <w:b/>
+          <w:bCs/>
+        </w:rPr>
+        <w:t xml:space="preserve"> </w:t>
+      </w:r>
+      <w:proofErr w:type="spellStart"/>
+      <w:r>
+        <w:rPr>
+          <w:b/>
+          <w:bCs/>
+        </w:rPr>
+        <w:t>penuh</w:t>
+      </w:r>
+      <w:proofErr w:type="spellEnd"/>
+      <w:r>
+        <w:t xml:space="preserve"> pada </w:t>
+      </w:r>
+      <w:proofErr w:type="spellStart"/>
+      <w:r>
+        <w:t>posisi</w:t>
+      </w:r>
+      <w:proofErr w:type="spellEnd"/>
+      <w:r>
+        <w:t xml:space="preserve"> </w:t>
+      </w:r>
+      <w:r>
+        <w:rPr>
+          <w:b/>
+          <w:bCs/>
+        </w:rPr>
+        <w:t>SOL/USDT</w:t>
+      </w:r>
+      <w:r>
+        <w:t xml:space="preserve"> dan </w:t>
+      </w:r>
+      <w:r>
+        <w:rPr>
+          <w:b/>
+          <w:bCs/>
+        </w:rPr>
+        <w:t>NEAR/USDT</w:t>
+      </w:r>
+      <w:r>
+        <w:t xml:space="preserve"> </w:t>
+      </w:r>
+      <w:proofErr w:type="spellStart"/>
+      <w:r>
+        <w:t>sampai</w:t>
+      </w:r>
+      <w:proofErr w:type="spellEnd"/>
+      <w:r>
+        <w:t xml:space="preserve"> </w:t>
+      </w:r>
+      <w:proofErr w:type="spellStart"/>
+      <w:r>
+        <w:t>benar-benar</w:t>
+      </w:r>
+      <w:proofErr w:type="spellEnd"/>
+      <w:r>
+        <w:t xml:space="preserve"> </w:t>
+      </w:r>
+      <w:proofErr w:type="spellStart"/>
+      <w:r>
+        <w:t>menyentuh</w:t>
+      </w:r>
+      <w:proofErr w:type="spellEnd"/>
+      <w:r>
+        <w:t xml:space="preserve"> Take Profit dan </w:t>
+      </w:r>
+      <w:proofErr w:type="spellStart"/>
+      <w:r>
+        <w:t>mencairkan</w:t>
+      </w:r>
+      <w:proofErr w:type="spellEnd"/>
+      <w:r>
+        <w:t xml:space="preserve"> uang </w:t>
+      </w:r>
+      <w:proofErr w:type="spellStart"/>
+      <w:r>
+        <w:t>tunai</w:t>
+      </w:r>
+      <w:proofErr w:type="spellEnd"/>
+      <w:r>
+        <w:t xml:space="preserve"> USDT </w:t>
+      </w:r>
+      <w:proofErr w:type="spellStart"/>
+      <w:r>
+        <w:t>ke</w:t>
+      </w:r>
+      <w:proofErr w:type="spellEnd"/>
+      <w:r>
+        <w:t xml:space="preserve"> </w:t>
+      </w:r>
+      <w:proofErr w:type="spellStart"/>
+      <w:r>
+        <w:t>akun</w:t>
+      </w:r>
+      <w:proofErr w:type="spellEnd"/>
+      <w:r>
+        <w:t xml:space="preserve"> Anda.</w:t>
+      </w:r>
+    </w:p>
+    <w:p>
+      <w:pPr>
+        <w:numPr>
+          <w:ilvl w:val="0"/>
+          <w:numId w:val="4"/>
+        </w:numPr>
+      </w:pPr>
+      <w:proofErr w:type="spellStart"/>
+      <w:r>
+        <w:rPr>
+          <w:b/>
+          <w:bCs/>
+        </w:rPr>
+        <w:t>Membangun</w:t>
+      </w:r>
+      <w:proofErr w:type="spellEnd"/>
+      <w:r>
+        <w:rPr>
+          <w:b/>
+          <w:bCs/>
+        </w:rPr>
+        <w:t xml:space="preserve"> </w:t>
+      </w:r>
+      <w:proofErr w:type="spellStart"/>
+      <w:r>
+        <w:rPr>
+          <w:b/>
+          <w:bCs/>
+        </w:rPr>
+        <w:t>Keyakinan</w:t>
+      </w:r>
+      <w:proofErr w:type="spellEnd"/>
+      <w:r>
+        <w:rPr>
+          <w:b/>
+          <w:bCs/>
+        </w:rPr>
+        <w:t xml:space="preserve"> Baja (</w:t>
+      </w:r>
+      <w:r>
+        <w:rPr>
+          <w:b/>
+          <w:bCs/>
+          <w:i/>
+          <w:iCs/>
+        </w:rPr>
+        <w:t>High Conviction</w:t>
+      </w:r>
+      <w:r>
+        <w:rPr>
+          <w:b/>
+          <w:bCs/>
+        </w:rPr>
+        <w:t>):</w:t>
+      </w:r>
+    </w:p>
+    <w:p>
+      <w:pPr>
+        <w:numPr>
+          <w:ilvl w:val="1"/>
+          <w:numId w:val="4"/>
+        </w:numPr>
+      </w:pPr>
+      <w:proofErr w:type="spellStart"/>
+      <w:r>
+        <w:t>Menambah</w:t>
+      </w:r>
+      <w:proofErr w:type="spellEnd"/>
+      <w:r>
+        <w:t xml:space="preserve"> modal </w:t>
+      </w:r>
+      <w:proofErr w:type="spellStart"/>
+      <w:r>
+        <w:t>saat</w:t>
+      </w:r>
+      <w:proofErr w:type="spellEnd"/>
+      <w:r>
+        <w:t xml:space="preserve"> Anda </w:t>
+      </w:r>
+      <w:proofErr w:type="spellStart"/>
+      <w:r>
+        <w:t>sudah</w:t>
+      </w:r>
+      <w:proofErr w:type="spellEnd"/>
+      <w:r>
+        <w:t xml:space="preserve"> </w:t>
+      </w:r>
+      <w:proofErr w:type="spellStart"/>
+      <w:r>
+        <w:t>melihat</w:t>
+      </w:r>
+      <w:proofErr w:type="spellEnd"/>
+      <w:r>
+        <w:t xml:space="preserve"> bot </w:t>
+      </w:r>
+      <w:proofErr w:type="spellStart"/>
+      <w:r>
+        <w:t>menghasilkan</w:t>
+      </w:r>
+      <w:proofErr w:type="spellEnd"/>
+      <w:r>
+        <w:t xml:space="preserve"> profit </w:t>
+      </w:r>
+      <w:proofErr w:type="spellStart"/>
+      <w:r>
+        <w:t>konsisten</w:t>
+      </w:r>
+      <w:proofErr w:type="spellEnd"/>
+      <w:r>
+        <w:t xml:space="preserve"> </w:t>
+      </w:r>
+      <w:proofErr w:type="spellStart"/>
+      <w:r>
+        <w:t>selama</w:t>
+      </w:r>
+      <w:proofErr w:type="spellEnd"/>
+      <w:r>
+        <w:t xml:space="preserve"> 2 </w:t>
+      </w:r>
+      <w:proofErr w:type="spellStart"/>
+      <w:r>
+        <w:t>minggu</w:t>
+      </w:r>
+      <w:proofErr w:type="spellEnd"/>
+      <w:r>
+        <w:t xml:space="preserve"> </w:t>
+      </w:r>
+      <w:proofErr w:type="spellStart"/>
+      <w:r>
+        <w:t>akan</w:t>
+      </w:r>
+      <w:proofErr w:type="spellEnd"/>
+      <w:r>
+        <w:t xml:space="preserve"> </w:t>
+      </w:r>
+      <w:proofErr w:type="spellStart"/>
+      <w:r>
+        <w:t>membuat</w:t>
+      </w:r>
+      <w:proofErr w:type="spellEnd"/>
+      <w:r>
+        <w:t xml:space="preserve"> </w:t>
+      </w:r>
+      <w:proofErr w:type="spellStart"/>
+      <w:r>
+        <w:t>hati</w:t>
+      </w:r>
+      <w:proofErr w:type="spellEnd"/>
+      <w:r>
+        <w:t xml:space="preserve"> Anda </w:t>
+      </w:r>
+      <w:r>
+        <w:rPr>
+          <w:b/>
+          <w:bCs/>
+        </w:rPr>
+        <w:t xml:space="preserve">sangat </w:t>
+      </w:r>
+      <w:proofErr w:type="spellStart"/>
+      <w:r>
+        <w:rPr>
+          <w:b/>
+          <w:bCs/>
+        </w:rPr>
+        <w:t>tenang</w:t>
+      </w:r>
+      <w:proofErr w:type="spellEnd"/>
+      <w:r>
+        <w:rPr>
+          <w:b/>
+          <w:bCs/>
+        </w:rPr>
+        <w:t xml:space="preserve"> dan </w:t>
+      </w:r>
+      <w:proofErr w:type="spellStart"/>
+      <w:r>
+        <w:rPr>
+          <w:b/>
+          <w:bCs/>
+        </w:rPr>
+        <w:t>percaya</w:t>
+      </w:r>
+      <w:proofErr w:type="spellEnd"/>
+      <w:r>
+        <w:rPr>
+          <w:b/>
+          <w:bCs/>
+        </w:rPr>
+        <w:t xml:space="preserve"> </w:t>
+      </w:r>
+      <w:proofErr w:type="spellStart"/>
+      <w:r>
+        <w:rPr>
+          <w:b/>
+          <w:bCs/>
+        </w:rPr>
+        <w:t>diri</w:t>
+      </w:r>
+      <w:proofErr w:type="spellEnd"/>
+      <w:r>
+        <w:t xml:space="preserve">, </w:t>
+      </w:r>
+      <w:proofErr w:type="spellStart"/>
+      <w:r>
+        <w:t>tanpa</w:t>
+      </w:r>
+      <w:proofErr w:type="spellEnd"/>
+      <w:r>
+        <w:t xml:space="preserve"> rasa was-was </w:t>
+      </w:r>
+      <w:proofErr w:type="spellStart"/>
+      <w:r>
+        <w:t>sedikit</w:t>
+      </w:r>
+      <w:proofErr w:type="spellEnd"/>
+      <w:r>
+        <w:t xml:space="preserve"> pun.</w:t>
+      </w:r>
+    </w:p>
+    <w:p>
+      <w:pPr>
+        <w:numPr>
+          <w:ilvl w:val="0"/>
+          <w:numId w:val="4"/>
+        </w:numPr>
+      </w:pPr>
+      <w:r>
+        <w:rPr>
+          <w:b/>
+          <w:bCs/>
+        </w:rPr>
+        <w:t xml:space="preserve">Modal Anda Saat Ini Sedang </w:t>
+      </w:r>
+      <w:proofErr w:type="spellStart"/>
+      <w:r>
+        <w:rPr>
+          <w:b/>
+          <w:bCs/>
+        </w:rPr>
+        <w:t>Bekerja</w:t>
+      </w:r>
+      <w:proofErr w:type="spellEnd"/>
+      <w:r>
+        <w:rPr>
+          <w:b/>
+          <w:bCs/>
+        </w:rPr>
+        <w:t xml:space="preserve"> </w:t>
+      </w:r>
+      <w:proofErr w:type="spellStart"/>
+      <w:r>
+        <w:rPr>
+          <w:b/>
+          <w:bCs/>
+        </w:rPr>
+        <w:t>Maksimal</w:t>
+      </w:r>
+      <w:proofErr w:type="spellEnd"/>
+      <w:r>
+        <w:rPr>
+          <w:b/>
+          <w:bCs/>
+        </w:rPr>
+        <w:t>:</w:t>
+      </w:r>
+    </w:p>
+    <w:p>
+      <w:pPr>
+        <w:numPr>
+          <w:ilvl w:val="1"/>
+          <w:numId w:val="4"/>
+        </w:numPr>
+      </w:pPr>
+      <w:r>
+        <w:t xml:space="preserve">Di </w:t>
+      </w:r>
+      <w:proofErr w:type="spellStart"/>
+      <w:r>
+        <w:t>akun</w:t>
+      </w:r>
+      <w:proofErr w:type="spellEnd"/>
+      <w:r>
+        <w:t xml:space="preserve"> Binance Anda, modal </w:t>
+      </w:r>
+      <w:r>
+        <w:rPr>
+          <w:b/>
+          <w:bCs/>
+        </w:rPr>
+        <w:t>Rp345.013,38</w:t>
+      </w:r>
+      <w:r>
+        <w:t xml:space="preserve"> </w:t>
+      </w:r>
+      <w:proofErr w:type="spellStart"/>
+      <w:r>
+        <w:t>sudah</w:t>
+      </w:r>
+      <w:proofErr w:type="spellEnd"/>
+      <w:r>
+        <w:t xml:space="preserve"> </w:t>
+      </w:r>
+      <w:proofErr w:type="spellStart"/>
+      <w:r>
+        <w:t>bekerja</w:t>
+      </w:r>
+      <w:proofErr w:type="spellEnd"/>
+      <w:r>
+        <w:t xml:space="preserve"> </w:t>
+      </w:r>
+      <w:proofErr w:type="spellStart"/>
+      <w:r>
+        <w:t>penuh</w:t>
+      </w:r>
+      <w:proofErr w:type="spellEnd"/>
+      <w:r>
+        <w:t xml:space="preserve"> </w:t>
+      </w:r>
+      <w:proofErr w:type="spellStart"/>
+      <w:r>
+        <w:t>memegang</w:t>
+      </w:r>
+      <w:proofErr w:type="spellEnd"/>
+      <w:r>
+        <w:t xml:space="preserve"> 2 </w:t>
+      </w:r>
+      <w:proofErr w:type="spellStart"/>
+      <w:r>
+        <w:t>koin</w:t>
+      </w:r>
+      <w:proofErr w:type="spellEnd"/>
+      <w:r>
+        <w:t xml:space="preserve"> </w:t>
+      </w:r>
+      <w:proofErr w:type="spellStart"/>
+      <w:r>
+        <w:t>primadona</w:t>
+      </w:r>
+      <w:proofErr w:type="spellEnd"/>
+      <w:r>
+        <w:t xml:space="preserve"> (</w:t>
+      </w:r>
+      <w:r>
+        <w:rPr>
+          <w:b/>
+          <w:bCs/>
+        </w:rPr>
+        <w:t>NEAR +2,31%</w:t>
+      </w:r>
+      <w:r>
+        <w:t xml:space="preserve"> dan </w:t>
+      </w:r>
+      <w:r>
+        <w:rPr>
+          <w:b/>
+          <w:bCs/>
+        </w:rPr>
+        <w:t>SOL</w:t>
+      </w:r>
+      <w:r>
+        <w:t xml:space="preserve">). </w:t>
+      </w:r>
+      <w:proofErr w:type="spellStart"/>
+      <w:r>
+        <w:t>Menambah</w:t>
+      </w:r>
+      <w:proofErr w:type="spellEnd"/>
+      <w:r>
+        <w:t xml:space="preserve"> modal </w:t>
+      </w:r>
+      <w:proofErr w:type="spellStart"/>
+      <w:r>
+        <w:t>saat</w:t>
+      </w:r>
+      <w:proofErr w:type="spellEnd"/>
+      <w:r>
+        <w:t xml:space="preserve"> </w:t>
+      </w:r>
+      <w:proofErr w:type="spellStart"/>
+      <w:r>
+        <w:t>ini</w:t>
+      </w:r>
+      <w:proofErr w:type="spellEnd"/>
+      <w:r>
+        <w:t xml:space="preserve"> </w:t>
+      </w:r>
+      <w:proofErr w:type="spellStart"/>
+      <w:r>
+        <w:t>tidak</w:t>
+      </w:r>
+      <w:proofErr w:type="spellEnd"/>
+      <w:r>
+        <w:t xml:space="preserve"> </w:t>
+      </w:r>
+      <w:proofErr w:type="spellStart"/>
+      <w:r>
+        <w:t>mendesak</w:t>
+      </w:r>
+      <w:proofErr w:type="spellEnd"/>
+      <w:r>
+        <w:t xml:space="preserve"> </w:t>
+      </w:r>
+      <w:proofErr w:type="spellStart"/>
+      <w:r>
+        <w:t>karena</w:t>
+      </w:r>
+      <w:proofErr w:type="spellEnd"/>
+      <w:r>
+        <w:t xml:space="preserve"> </w:t>
+      </w:r>
+      <w:proofErr w:type="spellStart"/>
+      <w:r>
+        <w:t>seluruh</w:t>
+      </w:r>
+      <w:proofErr w:type="spellEnd"/>
+      <w:r>
+        <w:t xml:space="preserve"> </w:t>
+      </w:r>
+      <w:proofErr w:type="spellStart"/>
+      <w:r>
+        <w:t>aset</w:t>
+      </w:r>
+      <w:proofErr w:type="spellEnd"/>
+      <w:r>
+        <w:t xml:space="preserve"> </w:t>
+      </w:r>
+      <w:proofErr w:type="spellStart"/>
+      <w:r>
+        <w:t>sedang</w:t>
+      </w:r>
+      <w:proofErr w:type="spellEnd"/>
+      <w:r>
+        <w:t xml:space="preserve"> </w:t>
+      </w:r>
+      <w:proofErr w:type="spellStart"/>
+      <w:r>
+        <w:t>bersiap</w:t>
+      </w:r>
+      <w:proofErr w:type="spellEnd"/>
+      <w:r>
+        <w:t xml:space="preserve"> </w:t>
+      </w:r>
+      <w:proofErr w:type="spellStart"/>
+      <w:r>
+        <w:t>menjemput</w:t>
+      </w:r>
+      <w:proofErr w:type="spellEnd"/>
+      <w:r>
+        <w:t xml:space="preserve"> target profit masing-masing.</w:t>
+      </w:r>
+    </w:p>
+    <w:p>
+      <w:r>
+        <w:pict w14:anchorId="35837AB3">
+          <v:rect id="_x0000_i1046" style="width:0;height:1.5pt" o:hralign="center" o:hrstd="t" o:hr="t" fillcolor="#a0a0a0" stroked="f"/>
+        </w:pict>
+      </w:r>
+    </w:p>
+    <w:p>
+      <w:pPr>
+        <w:rPr>
+          <w:b/>
+          <w:bCs/>
+        </w:rPr>
+      </w:pPr>
+      <w:r>
+        <w:rPr>
+          <w:b/>
+          <w:bCs/>
+        </w:rPr>
+        <w:t xml:space="preserve">2. </w:t>
+      </w:r>
+      <w:proofErr w:type="spellStart"/>
+      <w:r>
+        <w:rPr>
+          <w:b/>
+          <w:bCs/>
+        </w:rPr>
+        <w:t>Klarifikasi</w:t>
+      </w:r>
+      <w:proofErr w:type="spellEnd"/>
+      <w:r>
+        <w:rPr>
+          <w:b/>
+          <w:bCs/>
+        </w:rPr>
+        <w:t xml:space="preserve"> Target Take Profit NEAR/USDT ($5.00 vs $5.25)</w:t>
+      </w:r>
+    </w:p>
+    <w:p>
+      <w:r>
+        <w:t xml:space="preserve">Mengenai </w:t>
+      </w:r>
+      <w:proofErr w:type="spellStart"/>
+      <w:r>
+        <w:t>pertanyaan</w:t>
+      </w:r>
+      <w:proofErr w:type="spellEnd"/>
+      <w:r>
+        <w:t xml:space="preserve"> Anda </w:t>
+      </w:r>
+      <w:proofErr w:type="spellStart"/>
+      <w:r>
+        <w:t>tentang</w:t>
+      </w:r>
+      <w:proofErr w:type="spellEnd"/>
+      <w:r>
+        <w:t xml:space="preserve"> </w:t>
+      </w:r>
+      <w:proofErr w:type="spellStart"/>
+      <w:r>
+        <w:t>angka</w:t>
+      </w:r>
+      <w:proofErr w:type="spellEnd"/>
+      <w:r>
+        <w:t xml:space="preserve"> target Take Profit </w:t>
+      </w:r>
+      <w:proofErr w:type="gramStart"/>
+      <w:r>
+        <w:t>NEAR</w:t>
+      </w:r>
+      <w:proofErr w:type="gramEnd"/>
+      <w:r>
+        <w:t>:</w:t>
+      </w:r>
+    </w:p>
+    <w:p>
+      <w:pPr>
+        <w:numPr>
+          <w:ilvl w:val="0"/>
+          <w:numId w:val="5"/>
+        </w:numPr>
+      </w:pPr>
+      <w:r>
+        <w:rPr>
+          <w:b/>
+          <w:bCs/>
+        </w:rPr>
+        <w:t xml:space="preserve">Harga NEAR </w:t>
+      </w:r>
+      <w:proofErr w:type="spellStart"/>
+      <w:r>
+        <w:rPr>
+          <w:b/>
+          <w:bCs/>
+        </w:rPr>
+        <w:t>saat</w:t>
+      </w:r>
+      <w:proofErr w:type="spellEnd"/>
+      <w:r>
+        <w:rPr>
+          <w:b/>
+          <w:bCs/>
+        </w:rPr>
+        <w:t xml:space="preserve"> </w:t>
+      </w:r>
+      <w:proofErr w:type="spellStart"/>
+      <w:r>
+        <w:rPr>
+          <w:b/>
+          <w:bCs/>
+        </w:rPr>
+        <w:t>ini</w:t>
+      </w:r>
+      <w:proofErr w:type="spellEnd"/>
+      <w:r>
+        <w:rPr>
+          <w:b/>
+          <w:bCs/>
+        </w:rPr>
+        <w:t xml:space="preserve"> di pasar:</w:t>
+      </w:r>
+      <w:r>
+        <w:t xml:space="preserve"> </w:t>
+      </w:r>
+      <w:proofErr w:type="spellStart"/>
+      <w:r>
+        <w:t>Sudah</w:t>
+      </w:r>
+      <w:proofErr w:type="spellEnd"/>
+      <w:r>
+        <w:t xml:space="preserve"> </w:t>
+      </w:r>
+      <w:proofErr w:type="spellStart"/>
+      <w:r>
+        <w:t>berada</w:t>
+      </w:r>
+      <w:proofErr w:type="spellEnd"/>
+      <w:r>
+        <w:t xml:space="preserve"> di </w:t>
+      </w:r>
+      <w:proofErr w:type="spellStart"/>
+      <w:r>
+        <w:t>kisaran</w:t>
+      </w:r>
+      <w:proofErr w:type="spellEnd"/>
+      <w:r>
+        <w:t xml:space="preserve"> </w:t>
+      </w:r>
+      <w:r>
+        <w:rPr>
+          <w:b/>
+          <w:bCs/>
+        </w:rPr>
+        <w:t>$5.02 – $5.13</w:t>
+      </w:r>
+      <w:r>
+        <w:t xml:space="preserve"> (</w:t>
+      </w:r>
+      <w:proofErr w:type="spellStart"/>
+      <w:r>
+        <w:t>seperti</w:t>
+      </w:r>
+      <w:proofErr w:type="spellEnd"/>
+      <w:r>
+        <w:t xml:space="preserve"> </w:t>
+      </w:r>
+      <w:proofErr w:type="spellStart"/>
+      <w:r>
+        <w:t>terlihat</w:t>
+      </w:r>
+      <w:proofErr w:type="spellEnd"/>
+      <w:r>
+        <w:t xml:space="preserve"> di log scanner </w:t>
+      </w:r>
+      <w:proofErr w:type="spellStart"/>
+      <w:r>
+        <w:t>tadi</w:t>
+      </w:r>
+      <w:proofErr w:type="spellEnd"/>
+      <w:r>
+        <w:t>).</w:t>
+      </w:r>
+    </w:p>
+    <w:p>
+      <w:pPr>
+        <w:numPr>
+          <w:ilvl w:val="0"/>
+          <w:numId w:val="5"/>
+        </w:numPr>
+      </w:pPr>
+      <w:r>
+        <w:rPr>
+          <w:b/>
+          <w:bCs/>
+        </w:rPr>
+        <w:t>Target TP yang Tepat:</w:t>
+      </w:r>
+    </w:p>
+    <w:p>
+      <w:pPr>
+        <w:numPr>
+          <w:ilvl w:val="1"/>
+          <w:numId w:val="5"/>
+        </w:numPr>
+      </w:pPr>
+      <w:proofErr w:type="spellStart"/>
+      <w:r>
+        <w:t>Jangan</w:t>
+      </w:r>
+      <w:proofErr w:type="spellEnd"/>
+      <w:r>
+        <w:t xml:space="preserve"> </w:t>
+      </w:r>
+      <w:proofErr w:type="spellStart"/>
+      <w:r>
+        <w:t>memasang</w:t>
+      </w:r>
+      <w:proofErr w:type="spellEnd"/>
+      <w:r>
+        <w:t xml:space="preserve"> TP di $5.00, </w:t>
+      </w:r>
+      <w:proofErr w:type="spellStart"/>
+      <w:r>
+        <w:t>karena</w:t>
+      </w:r>
+      <w:proofErr w:type="spellEnd"/>
+      <w:r>
+        <w:t xml:space="preserve"> </w:t>
+      </w:r>
+      <w:proofErr w:type="spellStart"/>
+      <w:r>
+        <w:t>harga</w:t>
+      </w:r>
+      <w:proofErr w:type="spellEnd"/>
+      <w:r>
+        <w:t xml:space="preserve"> $5.00 </w:t>
+      </w:r>
+      <w:proofErr w:type="spellStart"/>
+      <w:r>
+        <w:t>sudah</w:t>
+      </w:r>
+      <w:proofErr w:type="spellEnd"/>
+      <w:r>
+        <w:t xml:space="preserve"> </w:t>
+      </w:r>
+      <w:proofErr w:type="spellStart"/>
+      <w:r>
+        <w:t>terlewati</w:t>
+      </w:r>
+      <w:proofErr w:type="spellEnd"/>
+      <w:r>
+        <w:t>!</w:t>
+      </w:r>
+    </w:p>
+    <w:p>
+      <w:pPr>
+        <w:numPr>
+          <w:ilvl w:val="1"/>
+          <w:numId w:val="5"/>
+        </w:numPr>
+      </w:pPr>
+      <w:r>
+        <w:t xml:space="preserve">Di </w:t>
+      </w:r>
+      <w:proofErr w:type="spellStart"/>
+      <w:r>
+        <w:t>skrip</w:t>
+      </w:r>
+      <w:proofErr w:type="spellEnd"/>
+      <w:r>
+        <w:t xml:space="preserve"> </w:t>
+      </w:r>
+      <w:proofErr w:type="spellStart"/>
+      <w:r>
+        <w:t>pendaftaran</w:t>
+      </w:r>
+      <w:proofErr w:type="spellEnd"/>
+      <w:r>
+        <w:t xml:space="preserve"> </w:t>
+      </w:r>
+      <w:proofErr w:type="spellStart"/>
+      <w:r>
+        <w:t>tadi</w:t>
+      </w:r>
+      <w:proofErr w:type="spellEnd"/>
+      <w:r>
+        <w:t xml:space="preserve">, </w:t>
+      </w:r>
+      <w:proofErr w:type="spellStart"/>
+      <w:r>
+        <w:t>kita</w:t>
+      </w:r>
+      <w:proofErr w:type="spellEnd"/>
+      <w:r>
+        <w:t xml:space="preserve"> </w:t>
+      </w:r>
+      <w:proofErr w:type="spellStart"/>
+      <w:r>
+        <w:t>memasang</w:t>
+      </w:r>
+      <w:proofErr w:type="spellEnd"/>
+      <w:r>
+        <w:t xml:space="preserve"> target </w:t>
+      </w:r>
+      <w:r>
+        <w:rPr>
+          <w:b/>
+          <w:bCs/>
+        </w:rPr>
+        <w:t>Take Profit di $5.25</w:t>
+      </w:r>
+      <w:r>
+        <w:t>:</w:t>
+      </w:r>
+      <w:r>
+        <w:br/>
+      </w:r>
+    </w:p>
+    <w:p>
+      <w:pPr>
+        <w:numPr>
+          <w:ilvl w:val="1"/>
+          <w:numId w:val="5"/>
+        </w:numPr>
+        <w:tabs>
+          <w:tab w:val="clear" w:pos="1440"/>
+        </w:tabs>
+      </w:pPr>
+      <w:r>
+        <w:t xml:space="preserve">        </w:t>
+      </w:r>
+    </w:p>
+    <w:p>
+      <w:r>
+        <w:lastRenderedPageBreak/>
+        <w:t xml:space="preserve">      </w:t>
+      </w:r>
+    </w:p>
+    <w:p>
+      <w:pPr>
+        <w:numPr>
+          <w:ilvl w:val="1"/>
+          <w:numId w:val="5"/>
+        </w:numPr>
+      </w:pPr>
+      <w:proofErr w:type="spellStart"/>
+      <w:r>
+        <w:t>Artinya</w:t>
+      </w:r>
+      <w:proofErr w:type="spellEnd"/>
+      <w:r>
+        <w:t xml:space="preserve">, </w:t>
+      </w:r>
+      <w:proofErr w:type="spellStart"/>
+      <w:r>
+        <w:t>begitu</w:t>
+      </w:r>
+      <w:proofErr w:type="spellEnd"/>
+      <w:r>
+        <w:t xml:space="preserve"> NEAR </w:t>
+      </w:r>
+      <w:proofErr w:type="spellStart"/>
+      <w:r>
+        <w:t>menyentuh</w:t>
+      </w:r>
+      <w:proofErr w:type="spellEnd"/>
+      <w:r>
+        <w:t xml:space="preserve"> </w:t>
+      </w:r>
+      <w:r>
+        <w:rPr>
+          <w:b/>
+          <w:bCs/>
+        </w:rPr>
+        <w:t>$5.25</w:t>
+      </w:r>
+      <w:r>
+        <w:t xml:space="preserve">, bot </w:t>
+      </w:r>
+      <w:proofErr w:type="spellStart"/>
+      <w:r>
+        <w:t>akan</w:t>
+      </w:r>
+      <w:proofErr w:type="spellEnd"/>
+      <w:r>
+        <w:t xml:space="preserve"> </w:t>
+      </w:r>
+      <w:proofErr w:type="spellStart"/>
+      <w:r>
+        <w:t>langsung</w:t>
+      </w:r>
+      <w:proofErr w:type="spellEnd"/>
+      <w:r>
+        <w:t xml:space="preserve"> me-sell </w:t>
+      </w:r>
+      <w:proofErr w:type="spellStart"/>
+      <w:r>
+        <w:t>koin</w:t>
+      </w:r>
+      <w:proofErr w:type="spellEnd"/>
+      <w:r>
+        <w:t xml:space="preserve"> </w:t>
+      </w:r>
+      <w:proofErr w:type="spellStart"/>
+      <w:r>
+        <w:t>tersebut</w:t>
+      </w:r>
+      <w:proofErr w:type="spellEnd"/>
+      <w:r>
+        <w:t xml:space="preserve"> dan </w:t>
+      </w:r>
+      <w:proofErr w:type="spellStart"/>
+      <w:r>
+        <w:t>menghasilkan</w:t>
+      </w:r>
+      <w:proofErr w:type="spellEnd"/>
+      <w:r>
+        <w:t xml:space="preserve"> </w:t>
+      </w:r>
+      <w:proofErr w:type="spellStart"/>
+      <w:r>
+        <w:t>keuntungan</w:t>
+      </w:r>
+      <w:proofErr w:type="spellEnd"/>
+      <w:r>
+        <w:t xml:space="preserve"> </w:t>
+      </w:r>
+      <w:proofErr w:type="spellStart"/>
+      <w:r>
+        <w:t>bersih</w:t>
+      </w:r>
+      <w:proofErr w:type="spellEnd"/>
+      <w:r>
+        <w:t xml:space="preserve"> </w:t>
+      </w:r>
+      <w:proofErr w:type="spellStart"/>
+      <w:r>
+        <w:t>sekitar</w:t>
+      </w:r>
+      <w:proofErr w:type="spellEnd"/>
+      <w:r>
+        <w:t xml:space="preserve"> </w:t>
+      </w:r>
+      <w:r>
+        <w:rPr>
+          <w:b/>
+          <w:bCs/>
+        </w:rPr>
+        <w:t>+$0.64 USDT (+6.5%)</w:t>
+      </w:r>
+      <w:r>
+        <w:t>!</w:t>
+      </w:r>
+    </w:p>
+    <w:p>
+      <w:r>
+        <w:pict w14:anchorId="1006F654">
+          <v:rect id="_x0000_i1047" style="width:0;height:1.5pt" o:hralign="center" o:hrstd="t" o:hr="t" fillcolor="#a0a0a0" stroked="f"/>
+        </w:pict>
+      </w:r>
+    </w:p>
+    <w:p>
+      <w:pPr>
+        <w:rPr>
+          <w:b/>
+          <w:bCs/>
+        </w:rPr>
+      </w:pPr>
+      <w:r>
+        <w:rPr>
+          <w:b/>
+          <w:bCs/>
+        </w:rPr>
+        <w:t xml:space="preserve">3. Apa yang Harus Anda </w:t>
+      </w:r>
+      <w:proofErr w:type="spellStart"/>
+      <w:r>
+        <w:rPr>
+          <w:b/>
+          <w:bCs/>
+        </w:rPr>
+        <w:t>Lakukan</w:t>
+      </w:r>
+      <w:proofErr w:type="spellEnd"/>
+      <w:r>
+        <w:rPr>
+          <w:b/>
+          <w:bCs/>
+        </w:rPr>
+        <w:t xml:space="preserve"> Selama 1–2 </w:t>
+      </w:r>
+      <w:proofErr w:type="spellStart"/>
+      <w:r>
+        <w:rPr>
+          <w:b/>
+          <w:bCs/>
+        </w:rPr>
+        <w:t>Minggu</w:t>
+      </w:r>
+      <w:proofErr w:type="spellEnd"/>
+      <w:r>
+        <w:rPr>
+          <w:b/>
+          <w:bCs/>
+        </w:rPr>
+        <w:t xml:space="preserve"> </w:t>
+      </w:r>
+      <w:proofErr w:type="spellStart"/>
+      <w:r>
+        <w:rPr>
+          <w:b/>
+          <w:bCs/>
+        </w:rPr>
+        <w:t>ke</w:t>
+      </w:r>
+      <w:proofErr w:type="spellEnd"/>
+      <w:r>
+        <w:rPr>
+          <w:b/>
+          <w:bCs/>
+        </w:rPr>
+        <w:t xml:space="preserve"> </w:t>
+      </w:r>
+      <w:proofErr w:type="spellStart"/>
+      <w:r>
+        <w:rPr>
+          <w:b/>
+          <w:bCs/>
+        </w:rPr>
+        <w:t>Depan</w:t>
+      </w:r>
+      <w:proofErr w:type="spellEnd"/>
+      <w:r>
+        <w:rPr>
+          <w:b/>
+          <w:bCs/>
+        </w:rPr>
+        <w:t>?</w:t>
+      </w:r>
+    </w:p>
+    <w:p>
+      <w:proofErr w:type="spellStart"/>
+      <w:r>
+        <w:t>Tugas</w:t>
+      </w:r>
+      <w:proofErr w:type="spellEnd"/>
+      <w:r>
+        <w:t xml:space="preserve"> </w:t>
+      </w:r>
+      <w:proofErr w:type="spellStart"/>
+      <w:r>
+        <w:t>teknis</w:t>
+      </w:r>
+      <w:proofErr w:type="spellEnd"/>
+      <w:r>
+        <w:t xml:space="preserve"> </w:t>
+      </w:r>
+      <w:proofErr w:type="spellStart"/>
+      <w:r>
+        <w:t>kita</w:t>
+      </w:r>
+      <w:proofErr w:type="spellEnd"/>
+      <w:r>
+        <w:t xml:space="preserve"> di </w:t>
+      </w:r>
+      <w:proofErr w:type="spellStart"/>
+      <w:r>
+        <w:t>kode</w:t>
+      </w:r>
+      <w:proofErr w:type="spellEnd"/>
+      <w:r>
+        <w:t xml:space="preserve"> dan server </w:t>
+      </w:r>
+      <w:r>
+        <w:rPr>
+          <w:b/>
+          <w:bCs/>
+        </w:rPr>
+        <w:t>SUDAH SELESAI 100%</w:t>
+      </w:r>
+      <w:r>
+        <w:t xml:space="preserve">. </w:t>
+      </w:r>
+      <w:proofErr w:type="spellStart"/>
+      <w:r>
+        <w:t>Sekarang</w:t>
+      </w:r>
+      <w:proofErr w:type="spellEnd"/>
+      <w:r>
+        <w:t xml:space="preserve"> Anda </w:t>
+      </w:r>
+      <w:proofErr w:type="spellStart"/>
+      <w:r>
+        <w:t>cukup</w:t>
+      </w:r>
+      <w:proofErr w:type="spellEnd"/>
+      <w:r>
+        <w:t xml:space="preserve"> </w:t>
+      </w:r>
+      <w:proofErr w:type="spellStart"/>
+      <w:r>
+        <w:t>beralih</w:t>
+      </w:r>
+      <w:proofErr w:type="spellEnd"/>
+      <w:r>
+        <w:t xml:space="preserve"> </w:t>
+      </w:r>
+      <w:proofErr w:type="spellStart"/>
+      <w:r>
+        <w:t>ke</w:t>
+      </w:r>
+      <w:proofErr w:type="spellEnd"/>
+      <w:r>
+        <w:t xml:space="preserve"> </w:t>
+      </w:r>
+      <w:proofErr w:type="spellStart"/>
+      <w:r>
+        <w:t>peran</w:t>
+      </w:r>
+      <w:proofErr w:type="spellEnd"/>
+      <w:r>
+        <w:t xml:space="preserve"> </w:t>
+      </w:r>
+      <w:r>
+        <w:rPr>
+          <w:b/>
+          <w:bCs/>
+        </w:rPr>
+        <w:t>"</w:t>
+      </w:r>
+      <w:proofErr w:type="spellStart"/>
+      <w:r>
+        <w:rPr>
+          <w:b/>
+          <w:bCs/>
+        </w:rPr>
+        <w:t>Manajer</w:t>
+      </w:r>
+      <w:proofErr w:type="spellEnd"/>
+      <w:r>
+        <w:rPr>
+          <w:b/>
+          <w:bCs/>
+        </w:rPr>
+        <w:t xml:space="preserve"> &amp; </w:t>
+      </w:r>
+      <w:proofErr w:type="spellStart"/>
+      <w:r>
+        <w:rPr>
+          <w:b/>
+          <w:bCs/>
+        </w:rPr>
+        <w:t>Pengamat</w:t>
+      </w:r>
+      <w:proofErr w:type="spellEnd"/>
+      <w:r>
+        <w:rPr>
+          <w:b/>
+          <w:bCs/>
+        </w:rPr>
+        <w:t>"</w:t>
+      </w:r>
+      <w:r>
+        <w:t>:</w:t>
+      </w:r>
+    </w:p>
+    <w:p>
+      <w:pPr>
+        <w:numPr>
+          <w:ilvl w:val="0"/>
+          <w:numId w:val="6"/>
+        </w:numPr>
+      </w:pPr>
+      <w:r>
+        <w:rPr>
+          <w:b/>
+          <w:bCs/>
+        </w:rPr>
+        <w:t xml:space="preserve">Duduk </w:t>
+      </w:r>
+      <w:proofErr w:type="spellStart"/>
+      <w:r>
+        <w:rPr>
+          <w:b/>
+          <w:bCs/>
+        </w:rPr>
+        <w:t>Tenang</w:t>
+      </w:r>
+      <w:proofErr w:type="spellEnd"/>
+      <w:r>
+        <w:rPr>
+          <w:b/>
+          <w:bCs/>
+        </w:rPr>
+        <w:t xml:space="preserve"> &amp; </w:t>
+      </w:r>
+      <w:proofErr w:type="spellStart"/>
+      <w:r>
+        <w:rPr>
+          <w:b/>
+          <w:bCs/>
+        </w:rPr>
+        <w:t>Nikmati</w:t>
+      </w:r>
+      <w:proofErr w:type="spellEnd"/>
+      <w:r>
+        <w:rPr>
+          <w:b/>
+          <w:bCs/>
+        </w:rPr>
+        <w:t xml:space="preserve"> Hari Anda:</w:t>
+      </w:r>
+    </w:p>
+    <w:p>
+      <w:pPr>
+        <w:numPr>
+          <w:ilvl w:val="1"/>
+          <w:numId w:val="6"/>
+        </w:numPr>
+      </w:pPr>
+      <w:r>
+        <w:t xml:space="preserve">Anda </w:t>
+      </w:r>
+      <w:proofErr w:type="spellStart"/>
+      <w:r>
+        <w:t>tidak</w:t>
+      </w:r>
+      <w:proofErr w:type="spellEnd"/>
+      <w:r>
+        <w:t xml:space="preserve"> </w:t>
+      </w:r>
+      <w:proofErr w:type="spellStart"/>
+      <w:r>
+        <w:t>perlu</w:t>
+      </w:r>
+      <w:proofErr w:type="spellEnd"/>
+      <w:r>
+        <w:t xml:space="preserve"> </w:t>
+      </w:r>
+      <w:proofErr w:type="spellStart"/>
+      <w:r>
+        <w:t>memelototi</w:t>
+      </w:r>
+      <w:proofErr w:type="spellEnd"/>
+      <w:r>
+        <w:t xml:space="preserve"> </w:t>
+      </w:r>
+      <w:proofErr w:type="spellStart"/>
+      <w:r>
+        <w:t>grafik</w:t>
+      </w:r>
+      <w:proofErr w:type="spellEnd"/>
+      <w:r>
+        <w:t xml:space="preserve"> candlestick </w:t>
+      </w:r>
+      <w:proofErr w:type="spellStart"/>
+      <w:r>
+        <w:t>atau</w:t>
+      </w:r>
+      <w:proofErr w:type="spellEnd"/>
+      <w:r>
+        <w:t xml:space="preserve"> </w:t>
+      </w:r>
+      <w:proofErr w:type="spellStart"/>
+      <w:r>
+        <w:t>membuka</w:t>
+      </w:r>
+      <w:proofErr w:type="spellEnd"/>
+      <w:r>
+        <w:t xml:space="preserve"> server Alibaba Cloud </w:t>
+      </w:r>
+      <w:proofErr w:type="spellStart"/>
+      <w:r>
+        <w:t>setiap</w:t>
+      </w:r>
+      <w:proofErr w:type="spellEnd"/>
+      <w:r>
+        <w:t xml:space="preserve"> jam. Bot di server </w:t>
+      </w:r>
+      <w:proofErr w:type="spellStart"/>
+      <w:r>
+        <w:t>bekerja</w:t>
+      </w:r>
+      <w:proofErr w:type="spellEnd"/>
+      <w:r>
+        <w:t xml:space="preserve"> 24 </w:t>
+      </w:r>
+      <w:proofErr w:type="gramStart"/>
+      <w:r>
+        <w:t>jam</w:t>
+      </w:r>
+      <w:proofErr w:type="gramEnd"/>
+      <w:r>
+        <w:t xml:space="preserve"> nonstop </w:t>
+      </w:r>
+      <w:proofErr w:type="spellStart"/>
+      <w:r>
+        <w:t>tanpa</w:t>
+      </w:r>
+      <w:proofErr w:type="spellEnd"/>
+      <w:r>
+        <w:t xml:space="preserve"> </w:t>
+      </w:r>
+      <w:proofErr w:type="spellStart"/>
+      <w:r>
+        <w:t>perlu</w:t>
+      </w:r>
+      <w:proofErr w:type="spellEnd"/>
+      <w:r>
+        <w:t xml:space="preserve"> </w:t>
+      </w:r>
+      <w:proofErr w:type="spellStart"/>
+      <w:r>
+        <w:t>ditemani</w:t>
+      </w:r>
+      <w:proofErr w:type="spellEnd"/>
+      <w:r>
+        <w:t>.</w:t>
+      </w:r>
+    </w:p>
+    <w:p>
+      <w:pPr>
+        <w:numPr>
+          <w:ilvl w:val="0"/>
+          <w:numId w:val="6"/>
+        </w:numPr>
+      </w:pPr>
+      <w:proofErr w:type="spellStart"/>
+      <w:r>
+        <w:rPr>
+          <w:b/>
+          <w:bCs/>
+        </w:rPr>
+        <w:t>Cukup</w:t>
+      </w:r>
+      <w:proofErr w:type="spellEnd"/>
+      <w:r>
+        <w:rPr>
+          <w:b/>
+          <w:bCs/>
+        </w:rPr>
+        <w:t xml:space="preserve"> </w:t>
+      </w:r>
+      <w:proofErr w:type="spellStart"/>
+      <w:r>
+        <w:rPr>
+          <w:b/>
+          <w:bCs/>
+        </w:rPr>
+        <w:t>Pantau</w:t>
+      </w:r>
+      <w:proofErr w:type="spellEnd"/>
+      <w:r>
+        <w:rPr>
+          <w:b/>
+          <w:bCs/>
+        </w:rPr>
+        <w:t xml:space="preserve"> </w:t>
+      </w:r>
+      <w:proofErr w:type="spellStart"/>
+      <w:r>
+        <w:rPr>
+          <w:b/>
+          <w:bCs/>
+        </w:rPr>
+        <w:t>Notifikasi</w:t>
+      </w:r>
+      <w:proofErr w:type="spellEnd"/>
+      <w:r>
+        <w:rPr>
+          <w:b/>
+          <w:bCs/>
+        </w:rPr>
+        <w:t xml:space="preserve"> Telegram:</w:t>
+      </w:r>
+    </w:p>
+    <w:p>
+      <w:pPr>
+        <w:numPr>
+          <w:ilvl w:val="1"/>
+          <w:numId w:val="6"/>
+        </w:numPr>
+        <w:rPr>
+          <w:b/>
+          <w:bCs/>
+        </w:rPr>
+      </w:pPr>
+      <w:proofErr w:type="spellStart"/>
+      <w:r>
+        <w:t>Begitu</w:t>
+      </w:r>
+      <w:proofErr w:type="spellEnd"/>
+      <w:r>
+        <w:t xml:space="preserve"> </w:t>
+      </w:r>
+      <w:proofErr w:type="spellStart"/>
+      <w:r>
+        <w:t>harga</w:t>
+      </w:r>
+      <w:proofErr w:type="spellEnd"/>
+      <w:r>
+        <w:t xml:space="preserve"> SOL </w:t>
+      </w:r>
+      <w:proofErr w:type="spellStart"/>
+      <w:r>
+        <w:t>mencapai</w:t>
+      </w:r>
+      <w:proofErr w:type="spellEnd"/>
+      <w:r>
+        <w:t xml:space="preserve"> </w:t>
+      </w:r>
+    </w:p>
+    <w:p>
+      <w:pPr>
+        <w:numPr>
+          <w:ilvl w:val="1"/>
+          <w:numId w:val="6"/>
+        </w:numPr>
+        <w:tabs>
+          <w:tab w:val="clear" w:pos="1440"/>
+        </w:tabs>
+        <w:rPr>
+          <w:b/>
+          <w:bCs/>
+        </w:rPr>
+      </w:pPr>
+      <w:r>
+        <w:rPr>
+          <w:b/>
+          <w:bCs/>
+        </w:rPr>
+        <w:t xml:space="preserve">        </w:t>
+      </w:r>
+    </w:p>
+    <w:p>
+      <w:r>
+        <w:rPr>
+          <w:b/>
+          <w:bCs/>
+        </w:rPr>
+        <w:t xml:space="preserve">      </w:t>
+      </w:r>
+    </w:p>
+    <w:p>
+      <w:r>
+        <w:rPr>
+          <w:b/>
+          <w:bCs/>
+        </w:rPr>
+        <w:t>5.25</w:t>
+      </w:r>
+      <w:r>
+        <w:t xml:space="preserve">, Telegram di </w:t>
+      </w:r>
+      <w:proofErr w:type="spellStart"/>
+      <w:r>
+        <w:t>ponsel</w:t>
+      </w:r>
+      <w:proofErr w:type="spellEnd"/>
+      <w:r>
+        <w:t xml:space="preserve"> Anda </w:t>
+      </w:r>
+      <w:proofErr w:type="spellStart"/>
+      <w:r>
+        <w:t>akan</w:t>
+      </w:r>
+      <w:proofErr w:type="spellEnd"/>
+      <w:r>
+        <w:t xml:space="preserve"> </w:t>
+      </w:r>
+      <w:proofErr w:type="spellStart"/>
+      <w:r>
+        <w:t>otomatis</w:t>
+      </w:r>
+      <w:proofErr w:type="spellEnd"/>
+      <w:r>
+        <w:t xml:space="preserve"> </w:t>
+      </w:r>
+      <w:proofErr w:type="spellStart"/>
+      <w:r>
+        <w:t>berbunyi</w:t>
+      </w:r>
+      <w:proofErr w:type="spellEnd"/>
+      <w:r>
+        <w:t xml:space="preserve"> </w:t>
+      </w:r>
+      <w:proofErr w:type="spellStart"/>
+      <w:r>
+        <w:t>mengirimkan</w:t>
+      </w:r>
+      <w:proofErr w:type="spellEnd"/>
+      <w:r>
+        <w:t xml:space="preserve"> </w:t>
+      </w:r>
+      <w:proofErr w:type="spellStart"/>
+      <w:r>
+        <w:t>laporan</w:t>
+      </w:r>
+      <w:proofErr w:type="spellEnd"/>
+      <w:r>
+        <w:t>:</w:t>
+      </w:r>
+      <w:r>
+        <w:br/>
+      </w:r>
+      <w:r>
+        <w:rPr>
+          <w:rFonts w:ascii="Segoe UI Emoji" w:hAnsi="Segoe UI Emoji" w:cs="Segoe UI Emoji"/>
+        </w:rPr>
+        <w:t>🍯</w:t>
+      </w:r>
+      <w:r>
+        <w:t xml:space="preserve"> [PROFIT WATERFALL HARVESTED] ... Take Profit Executed!</w:t>
+      </w:r>
+    </w:p>
+    <w:p>
+      <w:pPr>
+        <w:numPr>
+          <w:ilvl w:val="0"/>
+          <w:numId w:val="6"/>
+        </w:numPr>
+      </w:pPr>
+      <w:r>
+        <w:rPr>
+          <w:b/>
+          <w:bCs/>
+        </w:rPr>
+        <w:t xml:space="preserve">Kapan Waktu </w:t>
+      </w:r>
+      <w:proofErr w:type="spellStart"/>
+      <w:r>
+        <w:rPr>
+          <w:b/>
+          <w:bCs/>
+        </w:rPr>
+        <w:t>Terbaik</w:t>
+      </w:r>
+      <w:proofErr w:type="spellEnd"/>
+      <w:r>
+        <w:rPr>
+          <w:b/>
+          <w:bCs/>
+        </w:rPr>
+        <w:t xml:space="preserve"> </w:t>
+      </w:r>
+      <w:proofErr w:type="spellStart"/>
+      <w:r>
+        <w:rPr>
+          <w:b/>
+          <w:bCs/>
+        </w:rPr>
+        <w:t>Menambah</w:t>
+      </w:r>
+      <w:proofErr w:type="spellEnd"/>
+      <w:r>
+        <w:rPr>
+          <w:b/>
+          <w:bCs/>
+        </w:rPr>
+        <w:t xml:space="preserve"> Modal?</w:t>
+      </w:r>
+    </w:p>
+    <w:p>
+      <w:pPr>
+        <w:numPr>
+          <w:ilvl w:val="1"/>
+          <w:numId w:val="6"/>
+        </w:numPr>
+      </w:pPr>
+      <w:proofErr w:type="spellStart"/>
+      <w:r>
+        <w:t>Setelah</w:t>
+      </w:r>
+      <w:proofErr w:type="spellEnd"/>
+      <w:r>
+        <w:t xml:space="preserve"> </w:t>
+      </w:r>
+      <w:r>
+        <w:rPr>
+          <w:b/>
+          <w:bCs/>
+        </w:rPr>
+        <w:t xml:space="preserve">2 </w:t>
+      </w:r>
+      <w:proofErr w:type="spellStart"/>
+      <w:r>
+        <w:rPr>
+          <w:b/>
+          <w:bCs/>
+        </w:rPr>
+        <w:t>minggu</w:t>
+      </w:r>
+      <w:proofErr w:type="spellEnd"/>
+      <w:r>
+        <w:rPr>
+          <w:b/>
+          <w:bCs/>
+        </w:rPr>
+        <w:t xml:space="preserve"> </w:t>
+      </w:r>
+      <w:proofErr w:type="spellStart"/>
+      <w:r>
+        <w:rPr>
+          <w:b/>
+          <w:bCs/>
+        </w:rPr>
+        <w:t>atau</w:t>
+      </w:r>
+      <w:proofErr w:type="spellEnd"/>
+      <w:r>
+        <w:rPr>
+          <w:b/>
+          <w:bCs/>
+        </w:rPr>
+        <w:t xml:space="preserve"> 1 </w:t>
+      </w:r>
+      <w:proofErr w:type="spellStart"/>
+      <w:r>
+        <w:rPr>
+          <w:b/>
+          <w:bCs/>
+        </w:rPr>
+        <w:t>bulan</w:t>
+      </w:r>
+      <w:proofErr w:type="spellEnd"/>
+      <w:r>
+        <w:t xml:space="preserve">, </w:t>
+      </w:r>
+      <w:proofErr w:type="spellStart"/>
+      <w:r>
+        <w:t>ketika</w:t>
+      </w:r>
+      <w:proofErr w:type="spellEnd"/>
+      <w:r>
+        <w:t xml:space="preserve"> Anda </w:t>
+      </w:r>
+      <w:proofErr w:type="spellStart"/>
+      <w:r>
+        <w:t>melihat</w:t>
+      </w:r>
+      <w:proofErr w:type="spellEnd"/>
+      <w:r>
+        <w:t xml:space="preserve"> </w:t>
+      </w:r>
+      <w:proofErr w:type="spellStart"/>
+      <w:r>
+        <w:t>riwayat</w:t>
+      </w:r>
+      <w:proofErr w:type="spellEnd"/>
+      <w:r>
+        <w:t xml:space="preserve"> di menu /history Telegram </w:t>
+      </w:r>
+      <w:proofErr w:type="spellStart"/>
+      <w:r>
+        <w:t>mencatat</w:t>
+      </w:r>
+      <w:proofErr w:type="spellEnd"/>
+      <w:r>
+        <w:t xml:space="preserve"> </w:t>
+      </w:r>
+      <w:proofErr w:type="spellStart"/>
+      <w:r>
+        <w:t>rentetan</w:t>
+      </w:r>
+      <w:proofErr w:type="spellEnd"/>
+      <w:r>
+        <w:t xml:space="preserve"> </w:t>
+      </w:r>
+      <w:proofErr w:type="spellStart"/>
+      <w:r>
+        <w:t>kemenangan</w:t>
+      </w:r>
+      <w:proofErr w:type="spellEnd"/>
+      <w:r>
+        <w:t xml:space="preserve"> Take Profit yang </w:t>
+      </w:r>
+      <w:proofErr w:type="spellStart"/>
+      <w:r>
+        <w:t>rapi</w:t>
+      </w:r>
+      <w:proofErr w:type="spellEnd"/>
+      <w:r>
+        <w:t xml:space="preserve"> dan </w:t>
+      </w:r>
+      <w:proofErr w:type="spellStart"/>
+      <w:r>
+        <w:t>saldo</w:t>
+      </w:r>
+      <w:proofErr w:type="spellEnd"/>
+      <w:r>
+        <w:t xml:space="preserve"> Anda </w:t>
+      </w:r>
+      <w:proofErr w:type="spellStart"/>
+      <w:r>
+        <w:t>bertumbuh</w:t>
+      </w:r>
+      <w:proofErr w:type="spellEnd"/>
+      <w:r>
+        <w:t xml:space="preserve"> </w:t>
+      </w:r>
+      <w:proofErr w:type="spellStart"/>
+      <w:r>
+        <w:t>stabil</w:t>
+      </w:r>
+      <w:proofErr w:type="spellEnd"/>
+      <w:r>
+        <w:t>:</w:t>
+      </w:r>
+    </w:p>
+    <w:p>
+      <w:pPr>
+        <w:numPr>
+          <w:ilvl w:val="1"/>
+          <w:numId w:val="6"/>
+        </w:numPr>
+      </w:pPr>
+      <w:r>
+        <w:t xml:space="preserve">Di </w:t>
+      </w:r>
+      <w:proofErr w:type="spellStart"/>
+      <w:r>
+        <w:t>saat</w:t>
+      </w:r>
+      <w:proofErr w:type="spellEnd"/>
+      <w:r>
+        <w:t xml:space="preserve"> </w:t>
+      </w:r>
+      <w:proofErr w:type="spellStart"/>
+      <w:r>
+        <w:t>itulah</w:t>
+      </w:r>
+      <w:proofErr w:type="spellEnd"/>
+      <w:r>
+        <w:t xml:space="preserve"> Anda </w:t>
+      </w:r>
+      <w:proofErr w:type="spellStart"/>
+      <w:r>
+        <w:t>melakukan</w:t>
+      </w:r>
+      <w:proofErr w:type="spellEnd"/>
+      <w:r>
+        <w:t xml:space="preserve"> </w:t>
+      </w:r>
+      <w:proofErr w:type="spellStart"/>
+      <w:r>
+        <w:t>injeksi</w:t>
+      </w:r>
+      <w:proofErr w:type="spellEnd"/>
+      <w:r>
+        <w:t xml:space="preserve"> modal (</w:t>
+      </w:r>
+      <w:proofErr w:type="spellStart"/>
+      <w:r>
+        <w:t>misal</w:t>
+      </w:r>
+      <w:proofErr w:type="spellEnd"/>
+      <w:r>
+        <w:t xml:space="preserve"> </w:t>
+      </w:r>
+      <w:r>
+        <w:rPr>
+          <w:b/>
+          <w:bCs/>
+        </w:rPr>
+        <w:t>$50 s/d $100 USDT</w:t>
+      </w:r>
+      <w:r>
+        <w:t xml:space="preserve">). Uang </w:t>
+      </w:r>
+      <w:proofErr w:type="spellStart"/>
+      <w:r>
+        <w:t>baru</w:t>
+      </w:r>
+      <w:proofErr w:type="spellEnd"/>
+      <w:r>
+        <w:t xml:space="preserve"> </w:t>
+      </w:r>
+      <w:proofErr w:type="spellStart"/>
+      <w:r>
+        <w:t>tersebut</w:t>
+      </w:r>
+      <w:proofErr w:type="spellEnd"/>
+      <w:r>
+        <w:t xml:space="preserve"> </w:t>
+      </w:r>
+      <w:proofErr w:type="spellStart"/>
+      <w:r>
+        <w:t>akan</w:t>
+      </w:r>
+      <w:proofErr w:type="spellEnd"/>
+      <w:r>
+        <w:t xml:space="preserve"> </w:t>
+      </w:r>
+      <w:proofErr w:type="spellStart"/>
+      <w:r>
+        <w:t>langsung</w:t>
+      </w:r>
+      <w:proofErr w:type="spellEnd"/>
+      <w:r>
+        <w:t xml:space="preserve"> </w:t>
+      </w:r>
+      <w:proofErr w:type="spellStart"/>
+      <w:r>
+        <w:t>dilipatgandakan</w:t>
+      </w:r>
+      <w:proofErr w:type="spellEnd"/>
+      <w:r>
+        <w:t xml:space="preserve"> oleh bot </w:t>
+      </w:r>
+      <w:proofErr w:type="spellStart"/>
+      <w:r>
+        <w:t>dengan</w:t>
+      </w:r>
+      <w:proofErr w:type="spellEnd"/>
+      <w:r>
+        <w:t xml:space="preserve"> </w:t>
+      </w:r>
+      <w:proofErr w:type="spellStart"/>
+      <w:r>
+        <w:t>keyakinan</w:t>
+      </w:r>
+      <w:proofErr w:type="spellEnd"/>
+      <w:r>
+        <w:t xml:space="preserve"> </w:t>
+      </w:r>
+      <w:proofErr w:type="spellStart"/>
+      <w:r>
+        <w:t>penuh</w:t>
+      </w:r>
+      <w:proofErr w:type="spellEnd"/>
+      <w:r>
+        <w:t>!</w:t>
+      </w:r>
+    </w:p>
+    <w:p>
+      <w:proofErr w:type="spellStart"/>
+      <w:r>
+        <w:rPr>
+          <w:b/>
+          <w:bCs/>
+        </w:rPr>
+        <w:t>Rencana</w:t>
+      </w:r>
+      <w:proofErr w:type="spellEnd"/>
+      <w:r>
+        <w:rPr>
+          <w:b/>
+          <w:bCs/>
+        </w:rPr>
+        <w:t xml:space="preserve"> Anda </w:t>
+      </w:r>
+      <w:proofErr w:type="spellStart"/>
+      <w:r>
+        <w:rPr>
+          <w:b/>
+          <w:bCs/>
+        </w:rPr>
+        <w:t>sudah</w:t>
+      </w:r>
+      <w:proofErr w:type="spellEnd"/>
+      <w:r>
+        <w:rPr>
+          <w:b/>
+          <w:bCs/>
+        </w:rPr>
+        <w:t xml:space="preserve"> SANGAT TEPAT.</w:t>
+      </w:r>
+      <w:r>
+        <w:t xml:space="preserve"> </w:t>
+      </w:r>
+      <w:proofErr w:type="spellStart"/>
+      <w:r>
+        <w:t>Sistem</w:t>
+      </w:r>
+      <w:proofErr w:type="spellEnd"/>
+      <w:r>
+        <w:t xml:space="preserve"> </w:t>
+      </w:r>
+      <w:proofErr w:type="spellStart"/>
+      <w:r>
+        <w:t>sudah</w:t>
+      </w:r>
+      <w:proofErr w:type="spellEnd"/>
+      <w:r>
+        <w:t xml:space="preserve"> </w:t>
+      </w:r>
+      <w:proofErr w:type="spellStart"/>
+      <w:r>
+        <w:t>berjalan</w:t>
+      </w:r>
+      <w:proofErr w:type="spellEnd"/>
+      <w:r>
+        <w:t xml:space="preserve"> di </w:t>
+      </w:r>
+      <w:proofErr w:type="spellStart"/>
+      <w:r>
+        <w:t>jalur</w:t>
+      </w:r>
+      <w:proofErr w:type="spellEnd"/>
+      <w:r>
+        <w:t xml:space="preserve"> yang </w:t>
+      </w:r>
+      <w:proofErr w:type="spellStart"/>
+      <w:r>
+        <w:t>benar</w:t>
+      </w:r>
+      <w:proofErr w:type="spellEnd"/>
+      <w:r>
+        <w:t xml:space="preserve">, </w:t>
+      </w:r>
+      <w:proofErr w:type="spellStart"/>
+      <w:r>
+        <w:t>mari</w:t>
+      </w:r>
+      <w:proofErr w:type="spellEnd"/>
+      <w:r>
+        <w:t xml:space="preserve"> </w:t>
+      </w:r>
+      <w:proofErr w:type="spellStart"/>
+      <w:r>
+        <w:t>kita</w:t>
+      </w:r>
+      <w:proofErr w:type="spellEnd"/>
+      <w:r>
+        <w:t xml:space="preserve"> </w:t>
+      </w:r>
+      <w:proofErr w:type="spellStart"/>
+      <w:r>
+        <w:t>biarkan</w:t>
+      </w:r>
+      <w:proofErr w:type="spellEnd"/>
+      <w:r>
+        <w:t xml:space="preserve"> </w:t>
+      </w:r>
+      <w:proofErr w:type="spellStart"/>
+      <w:r>
+        <w:t>mesin</w:t>
+      </w:r>
+      <w:proofErr w:type="spellEnd"/>
+      <w:r>
+        <w:t xml:space="preserve"> predator </w:t>
+      </w:r>
+      <w:proofErr w:type="spellStart"/>
+      <w:r>
+        <w:t>ini</w:t>
+      </w:r>
+      <w:proofErr w:type="spellEnd"/>
+      <w:r>
+        <w:t xml:space="preserve"> </w:t>
+      </w:r>
+      <w:proofErr w:type="spellStart"/>
+      <w:r>
+        <w:t>berburu</w:t>
+      </w:r>
+      <w:proofErr w:type="spellEnd"/>
+      <w:r>
+        <w:t xml:space="preserve"> </w:t>
+      </w:r>
+      <w:proofErr w:type="spellStart"/>
+      <w:r>
+        <w:t>secara</w:t>
+      </w:r>
+      <w:proofErr w:type="spellEnd"/>
+      <w:r>
+        <w:t xml:space="preserve"> </w:t>
+      </w:r>
+      <w:proofErr w:type="spellStart"/>
+      <w:r>
+        <w:t>mandiri</w:t>
+      </w:r>
+      <w:proofErr w:type="spellEnd"/>
+      <w:r>
+        <w:t>!</w:t>
+      </w:r>
+    </w:p>
+    <w:p/>
     <w:p/>
     <w:sectPr>
       <w:pgSz w:w="12240" w:h="15840"/>
@@ -2638,9 +5493,126 @@
 <file path=word/numbering.xml><?xml version="1.0" encoding="utf-8"?>
 <w:numbering xmlns:wpc="http://schemas.microsoft.com/office/word/2010/wordprocessingCanvas" xmlns:cx="http://schemas.microsoft.com/office/drawing/2014/chartex" xmlns:cx1="http://schemas.microsoft.com/office/drawing/2015/9/8/chartex" xmlns:cx2="http://schemas.microsoft.com/office/drawing/2015/10/21/chartex" xmlns:cx3="http://schemas.microsoft.com/office/drawing/2016/5/9/chartex" xmlns:cx4="http://schemas.microsoft.com/office/drawing/2016/5/10/chartex" xmlns:cx5="http://schemas.microsoft.com/office/drawing/2016/5/11/chartex" xmlns:cx6="http://schemas.microsoft.com/office/drawing/2016/5/12/chartex" xmlns:cx7="http://schemas.microsoft.com/office/drawing/2016/5/13/chartex" xmlns:cx8="http://schemas.microsoft.com/office/drawing/2016/5/14/chartex" xmlns:mc="http://schemas.openxmlformats.org/markup-compatibility/2006" xmlns:aink="http://schemas.microsoft.com/office/drawing/2016/ink" xmlns:am3d="http://schemas.microsoft.com/office/drawing/2017/model3d" xmlns:o="urn:schemas-microsoft-com:office:office" xmlns:oel="http://schemas.microsoft.com/office/2019/extlst" xmlns:r="http://schemas.openxmlformats.org/officeDocument/2006/relationships" xmlns:m="http://schemas.openxmlformats.org/officeDocument/2006/math" xmlns:v="urn:schemas-microsoft-com:vml" xmlns:wp14="http://schemas.microsoft.com/office/word/2010/wordprocessingDrawing" xmlns:wp="http://schemas.openxmlformats.org/drawingml/2006/wordprocessingDrawing" xmlns:w10="urn:schemas-microsoft-com:office:word" xmlns:w="http://schemas.openxmlformats.org/wordprocessingml/2006/main" xmlns:w14="http://schemas.microsoft.com/office/word/2010/wordml" xmlns:w15="http://schemas.microsoft.com/office/word/2012/wordml" xmlns:w16cex="http://schemas.microsoft.com/office/word/2018/wordml/cex" xmlns:w16cid="http://schemas.microsoft.com/office/word/2016/wordml/cid" xmlns:w16="http://schemas.microsoft.com/office/word/2018/wordml" xmlns:w16du="http://schemas.microsoft.com/office/word/2023/wordml/word16du" xmlns:w16sdtdh="http://schemas.microsoft.com/office/word/2020/wordml/sdtdatahash" xmlns:w16sdtfl="http://schemas.microsoft.com/office/word/2024/wordml/sdtformatlock" xmlns:w16se="http://schemas.microsoft.com/office/word/2015/wordml/symex" xmlns:wpg="http://schemas.microsoft.com/office/word/2010/wordprocessingGroup" xmlns:wpi="http://schemas.microsoft.com/office/word/2010/wordprocessingInk" xmlns:wne="http://schemas.microsoft.com/office/word/2006/wordml" xmlns:wps="http://schemas.microsoft.com/office/word/2010/wordprocessingShape" mc:Ignorable="w14 w15 w16se w16cid w16 w16cex w16sdtdh w16sdtfl w16du wp14">
   <w:abstractNum w:abstractNumId="0" w15:restartNumberingAfterBreak="0">
-    <w:nsid w:val="5D8B75DA"/>
+    <w:nsid w:val="41870A51"/>
     <w:multiLevelType w:val="multilevel"/>
-    <w:tmpl w:val="E5128E38"/>
+    <w:tmpl w:val="EFBC96B0"/>
+    <w:lvl w:ilvl="0">
+      <w:start w:val="1"/>
+      <w:numFmt w:val="decimal"/>
+      <w:lvlText w:val="%1."/>
+      <w:lvlJc w:val="left"/>
+      <w:pPr>
+        <w:tabs>
+          <w:tab w:val="num" w:pos="720"/>
+        </w:tabs>
+        <w:ind w:left="720" w:hanging="360"/>
+      </w:pPr>
+    </w:lvl>
+    <w:lvl w:ilvl="1">
+      <w:start w:val="1"/>
+      <w:numFmt w:val="bullet"/>
+      <w:lvlText w:val="o"/>
+      <w:lvlJc w:val="left"/>
+      <w:pPr>
+        <w:tabs>
+          <w:tab w:val="num" w:pos="1440"/>
+        </w:tabs>
+        <w:ind w:left="1440" w:hanging="360"/>
+      </w:pPr>
+      <w:rPr>
+        <w:rFonts w:ascii="Courier New" w:hAnsi="Courier New" w:hint="default"/>
+        <w:sz w:val="20"/>
+      </w:rPr>
+    </w:lvl>
+    <w:lvl w:ilvl="2" w:tentative="1">
+      <w:start w:val="1"/>
+      <w:numFmt w:val="decimal"/>
+      <w:lvlText w:val="%3."/>
+      <w:lvlJc w:val="left"/>
+      <w:pPr>
+        <w:tabs>
+          <w:tab w:val="num" w:pos="2160"/>
+        </w:tabs>
+        <w:ind w:left="2160" w:hanging="360"/>
+      </w:pPr>
+    </w:lvl>
+    <w:lvl w:ilvl="3" w:tentative="1">
+      <w:start w:val="1"/>
+      <w:numFmt w:val="decimal"/>
+      <w:lvlText w:val="%4."/>
+      <w:lvlJc w:val="left"/>
+      <w:pPr>
+        <w:tabs>
+          <w:tab w:val="num" w:pos="2880"/>
+        </w:tabs>
+        <w:ind w:left="2880" w:hanging="360"/>
+      </w:pPr>
+    </w:lvl>
+    <w:lvl w:ilvl="4" w:tentative="1">
+      <w:start w:val="1"/>
+      <w:numFmt w:val="decimal"/>
+      <w:lvlText w:val="%5."/>
+      <w:lvlJc w:val="left"/>
+      <w:pPr>
+        <w:tabs>
+          <w:tab w:val="num" w:pos="3600"/>
+        </w:tabs>
+        <w:ind w:left="3600" w:hanging="360"/>
+      </w:pPr>
+    </w:lvl>
+    <w:lvl w:ilvl="5" w:tentative="1">
+      <w:start w:val="1"/>
+      <w:numFmt w:val="decimal"/>
+      <w:lvlText w:val="%6."/>
+      <w:lvlJc w:val="left"/>
+      <w:pPr>
+        <w:tabs>
+          <w:tab w:val="num" w:pos="4320"/>
+        </w:tabs>
+        <w:ind w:left="4320" w:hanging="360"/>
+      </w:pPr>
+    </w:lvl>
+    <w:lvl w:ilvl="6" w:tentative="1">
+      <w:start w:val="1"/>
+      <w:numFmt w:val="decimal"/>
+      <w:lvlText w:val="%7."/>
+      <w:lvlJc w:val="left"/>
+      <w:pPr>
+        <w:tabs>
+          <w:tab w:val="num" w:pos="5040"/>
+        </w:tabs>
+        <w:ind w:left="5040" w:hanging="360"/>
+      </w:pPr>
+    </w:lvl>
+    <w:lvl w:ilvl="7" w:tentative="1">
+      <w:start w:val="1"/>
+      <w:numFmt w:val="decimal"/>
+      <w:lvlText w:val="%8."/>
+      <w:lvlJc w:val="left"/>
+      <w:pPr>
+        <w:tabs>
+          <w:tab w:val="num" w:pos="5760"/>
+        </w:tabs>
+        <w:ind w:left="5760" w:hanging="360"/>
+      </w:pPr>
+    </w:lvl>
+    <w:lvl w:ilvl="8" w:tentative="1">
+      <w:start w:val="1"/>
+      <w:numFmt w:val="decimal"/>
+      <w:lvlText w:val="%9."/>
+      <w:lvlJc w:val="left"/>
+      <w:pPr>
+        <w:tabs>
+          <w:tab w:val="num" w:pos="6480"/>
+        </w:tabs>
+        <w:ind w:left="6480" w:hanging="360"/>
+      </w:pPr>
+    </w:lvl>
+  </w:abstractNum>
+  <w:abstractNum w:abstractNumId="1" w15:restartNumberingAfterBreak="0">
+    <w:nsid w:val="50494D0E"/>
+    <w:multiLevelType w:val="multilevel"/>
+    <w:tmpl w:val="8A50982C"/>
     <w:lvl w:ilvl="0">
       <w:start w:val="1"/>
       <w:numFmt w:val="decimal"/>
@@ -2758,7 +5730,128 @@
       </w:pPr>
     </w:lvl>
   </w:abstractNum>
-  <w:abstractNum w:abstractNumId="1" w15:restartNumberingAfterBreak="0">
+  <w:abstractNum w:abstractNumId="2" w15:restartNumberingAfterBreak="0">
+    <w:nsid w:val="5D8B75DA"/>
+    <w:multiLevelType w:val="multilevel"/>
+    <w:tmpl w:val="E5128E38"/>
+    <w:lvl w:ilvl="0">
+      <w:start w:val="1"/>
+      <w:numFmt w:val="decimal"/>
+      <w:lvlText w:val="%1."/>
+      <w:lvlJc w:val="left"/>
+      <w:pPr>
+        <w:tabs>
+          <w:tab w:val="num" w:pos="720"/>
+        </w:tabs>
+        <w:ind w:left="720" w:hanging="360"/>
+      </w:pPr>
+    </w:lvl>
+    <w:lvl w:ilvl="1">
+      <w:start w:val="1"/>
+      <w:numFmt w:val="bullet"/>
+      <w:lvlText w:val="o"/>
+      <w:lvlJc w:val="left"/>
+      <w:pPr>
+        <w:tabs>
+          <w:tab w:val="num" w:pos="1440"/>
+        </w:tabs>
+        <w:ind w:left="1440" w:hanging="360"/>
+      </w:pPr>
+      <w:rPr>
+        <w:rFonts w:ascii="Courier New" w:hAnsi="Courier New" w:hint="default"/>
+        <w:sz w:val="20"/>
+      </w:rPr>
+    </w:lvl>
+    <w:lvl w:ilvl="2">
+      <w:start w:val="1"/>
+      <w:numFmt w:val="bullet"/>
+      <w:lvlText w:val=""/>
+      <w:lvlJc w:val="left"/>
+      <w:pPr>
+        <w:tabs>
+          <w:tab w:val="num" w:pos="2160"/>
+        </w:tabs>
+        <w:ind w:left="2160" w:hanging="360"/>
+      </w:pPr>
+      <w:rPr>
+        <w:rFonts w:ascii="Wingdings" w:hAnsi="Wingdings" w:hint="default"/>
+        <w:sz w:val="20"/>
+      </w:rPr>
+    </w:lvl>
+    <w:lvl w:ilvl="3" w:tentative="1">
+      <w:start w:val="1"/>
+      <w:numFmt w:val="decimal"/>
+      <w:lvlText w:val="%4."/>
+      <w:lvlJc w:val="left"/>
+      <w:pPr>
+        <w:tabs>
+          <w:tab w:val="num" w:pos="2880"/>
+        </w:tabs>
+        <w:ind w:left="2880" w:hanging="360"/>
+      </w:pPr>
+    </w:lvl>
+    <w:lvl w:ilvl="4" w:tentative="1">
+      <w:start w:val="1"/>
+      <w:numFmt w:val="decimal"/>
+      <w:lvlText w:val="%5."/>
+      <w:lvlJc w:val="left"/>
+      <w:pPr>
+        <w:tabs>
+          <w:tab w:val="num" w:pos="3600"/>
+        </w:tabs>
+        <w:ind w:left="3600" w:hanging="360"/>
+      </w:pPr>
+    </w:lvl>
+    <w:lvl w:ilvl="5" w:tentative="1">
+      <w:start w:val="1"/>
+      <w:numFmt w:val="decimal"/>
+      <w:lvlText w:val="%6."/>
+      <w:lvlJc w:val="left"/>
+      <w:pPr>
+        <w:tabs>
+          <w:tab w:val="num" w:pos="4320"/>
+        </w:tabs>
+        <w:ind w:left="4320" w:hanging="360"/>
+      </w:pPr>
+    </w:lvl>
+    <w:lvl w:ilvl="6" w:tentative="1">
+      <w:start w:val="1"/>
+      <w:numFmt w:val="decimal"/>
+      <w:lvlText w:val="%7."/>
+      <w:lvlJc w:val="left"/>
+      <w:pPr>
+        <w:tabs>
+          <w:tab w:val="num" w:pos="5040"/>
+        </w:tabs>
+        <w:ind w:left="5040" w:hanging="360"/>
+      </w:pPr>
+    </w:lvl>
+    <w:lvl w:ilvl="7" w:tentative="1">
+      <w:start w:val="1"/>
+      <w:numFmt w:val="decimal"/>
+      <w:lvlText w:val="%8."/>
+      <w:lvlJc w:val="left"/>
+      <w:pPr>
+        <w:tabs>
+          <w:tab w:val="num" w:pos="5760"/>
+        </w:tabs>
+        <w:ind w:left="5760" w:hanging="360"/>
+      </w:pPr>
+    </w:lvl>
+    <w:lvl w:ilvl="8" w:tentative="1">
+      <w:start w:val="1"/>
+      <w:numFmt w:val="decimal"/>
+      <w:lvlText w:val="%9."/>
+      <w:lvlJc w:val="left"/>
+      <w:pPr>
+        <w:tabs>
+          <w:tab w:val="num" w:pos="6480"/>
+        </w:tabs>
+        <w:ind w:left="6480" w:hanging="360"/>
+      </w:pPr>
+    </w:lvl>
+  </w:abstractNum>
+  <w:abstractNum w:abstractNumId="3" w15:restartNumberingAfterBreak="0">
     <w:nsid w:val="7ADE6306"/>
     <w:multiLevelType w:val="multilevel"/>
     <w:tmpl w:val="6A941D58"/>
@@ -2875,14 +5968,163 @@
       </w:pPr>
     </w:lvl>
   </w:abstractNum>
+  <w:abstractNum w:abstractNumId="4" w15:restartNumberingAfterBreak="0">
+    <w:nsid w:val="7D167D5F"/>
+    <w:multiLevelType w:val="multilevel"/>
+    <w:tmpl w:val="1278D9E8"/>
+    <w:lvl w:ilvl="0">
+      <w:start w:val="1"/>
+      <w:numFmt w:val="bullet"/>
+      <w:lvlText w:val=""/>
+      <w:lvlJc w:val="left"/>
+      <w:pPr>
+        <w:tabs>
+          <w:tab w:val="num" w:pos="720"/>
+        </w:tabs>
+        <w:ind w:left="720" w:hanging="360"/>
+      </w:pPr>
+      <w:rPr>
+        <w:rFonts w:ascii="Symbol" w:hAnsi="Symbol" w:hint="default"/>
+        <w:sz w:val="20"/>
+      </w:rPr>
+    </w:lvl>
+    <w:lvl w:ilvl="1">
+      <w:start w:val="1"/>
+      <w:numFmt w:val="bullet"/>
+      <w:lvlText w:val="o"/>
+      <w:lvlJc w:val="left"/>
+      <w:pPr>
+        <w:tabs>
+          <w:tab w:val="num" w:pos="1440"/>
+        </w:tabs>
+        <w:ind w:left="1440" w:hanging="360"/>
+      </w:pPr>
+      <w:rPr>
+        <w:rFonts w:ascii="Courier New" w:hAnsi="Courier New" w:hint="default"/>
+        <w:sz w:val="20"/>
+      </w:rPr>
+    </w:lvl>
+    <w:lvl w:ilvl="2" w:tentative="1">
+      <w:start w:val="1"/>
+      <w:numFmt w:val="bullet"/>
+      <w:lvlText w:val=""/>
+      <w:lvlJc w:val="left"/>
+      <w:pPr>
+        <w:tabs>
+          <w:tab w:val="num" w:pos="2160"/>
+        </w:tabs>
+        <w:ind w:left="2160" w:hanging="360"/>
+      </w:pPr>
+      <w:rPr>
+        <w:rFonts w:ascii="Wingdings" w:hAnsi="Wingdings" w:hint="default"/>
+        <w:sz w:val="20"/>
+      </w:rPr>
+    </w:lvl>
+    <w:lvl w:ilvl="3" w:tentative="1">
+      <w:start w:val="1"/>
+      <w:numFmt w:val="bullet"/>
+      <w:lvlText w:val=""/>
+      <w:lvlJc w:val="left"/>
+      <w:pPr>
+        <w:tabs>
+          <w:tab w:val="num" w:pos="2880"/>
+        </w:tabs>
+        <w:ind w:left="2880" w:hanging="360"/>
+      </w:pPr>
+      <w:rPr>
+        <w:rFonts w:ascii="Wingdings" w:hAnsi="Wingdings" w:hint="default"/>
+        <w:sz w:val="20"/>
+      </w:rPr>
+    </w:lvl>
+    <w:lvl w:ilvl="4" w:tentative="1">
+      <w:start w:val="1"/>
+      <w:numFmt w:val="bullet"/>
+      <w:lvlText w:val=""/>
+      <w:lvlJc w:val="left"/>
+      <w:pPr>
+        <w:tabs>
+          <w:tab w:val="num" w:pos="3600"/>
+        </w:tabs>
+        <w:ind w:left="3600" w:hanging="360"/>
+      </w:pPr>
+      <w:rPr>
+        <w:rFonts w:ascii="Wingdings" w:hAnsi="Wingdings" w:hint="default"/>
+        <w:sz w:val="20"/>
+      </w:rPr>
+    </w:lvl>
+    <w:lvl w:ilvl="5" w:tentative="1">
+      <w:start w:val="1"/>
+      <w:numFmt w:val="bullet"/>
+      <w:lvlText w:val=""/>
+      <w:lvlJc w:val="left"/>
+      <w:pPr>
+        <w:tabs>
+          <w:tab w:val="num" w:pos="4320"/>
+        </w:tabs>
+        <w:ind w:left="4320" w:hanging="360"/>
+      </w:pPr>
+      <w:rPr>
+        <w:rFonts w:ascii="Wingdings" w:hAnsi="Wingdings" w:hint="default"/>
+        <w:sz w:val="20"/>
+      </w:rPr>
+    </w:lvl>
+    <w:lvl w:ilvl="6" w:tentative="1">
+      <w:start w:val="1"/>
+      <w:numFmt w:val="bullet"/>
+      <w:lvlText w:val=""/>
+      <w:lvlJc w:val="left"/>
+      <w:pPr>
+        <w:tabs>
+          <w:tab w:val="num" w:pos="5040"/>
+        </w:tabs>
+        <w:ind w:left="5040" w:hanging="360"/>
+      </w:pPr>
+      <w:rPr>
+        <w:rFonts w:ascii="Wingdings" w:hAnsi="Wingdings" w:hint="default"/>
+        <w:sz w:val="20"/>
+      </w:rPr>
+    </w:lvl>
+    <w:lvl w:ilvl="7" w:tentative="1">
+      <w:start w:val="1"/>
+      <w:numFmt w:val="bullet"/>
+      <w:lvlText w:val=""/>
+      <w:lvlJc w:val="left"/>
+      <w:pPr>
+        <w:tabs>
+          <w:tab w:val="num" w:pos="5760"/>
+        </w:tabs>
+        <w:ind w:left="5760" w:hanging="360"/>
+      </w:pPr>
+      <w:rPr>
+        <w:rFonts w:ascii="Wingdings" w:hAnsi="Wingdings" w:hint="default"/>
+        <w:sz w:val="20"/>
+      </w:rPr>
+    </w:lvl>
+    <w:lvl w:ilvl="8" w:tentative="1">
+      <w:start w:val="1"/>
+      <w:numFmt w:val="bullet"/>
+      <w:lvlText w:val=""/>
+      <w:lvlJc w:val="left"/>
+      <w:pPr>
+        <w:tabs>
+          <w:tab w:val="num" w:pos="6480"/>
+        </w:tabs>
+        <w:ind w:left="6480" w:hanging="360"/>
+      </w:pPr>
+      <w:rPr>
+        <w:rFonts w:ascii="Wingdings" w:hAnsi="Wingdings" w:hint="default"/>
+        <w:sz w:val="20"/>
+      </w:rPr>
+    </w:lvl>
+  </w:abstractNum>
   <w:num w:numId="1" w16cid:durableId="393435274">
-    <w:abstractNumId w:val="1"/>
+    <w:abstractNumId w:val="3"/>
   </w:num>
   <w:num w:numId="2" w16cid:durableId="1217550654">
-    <w:abstractNumId w:val="0"/>
+    <w:abstractNumId w:val="2"/>
   </w:num>
   <w:num w:numId="3" w16cid:durableId="1234899552">
-    <w:abstractNumId w:val="0"/>
+    <w:abstractNumId w:val="2"/>
     <w:lvlOverride w:ilvl="2">
       <w:lvl w:ilvl="2">
         <w:numFmt w:val="decimal"/>
@@ -2890,6 +6132,15 @@
         <w:lvlJc w:val="left"/>
       </w:lvl>
     </w:lvlOverride>
+  </w:num>
+  <w:num w:numId="4" w16cid:durableId="588579726">
+    <w:abstractNumId w:val="1"/>
+  </w:num>
+  <w:num w:numId="5" w16cid:durableId="568156017">
+    <w:abstractNumId w:val="4"/>
+  </w:num>
+  <w:num w:numId="6" w16cid:durableId="1158687308">
+    <w:abstractNumId w:val="0"/>
   </w:num>
 </w:numbering>
 </file>

</xml_diff>